<commit_message>
Add Setun/Brusentsov historical lineage paragraph to intro of both papers
</commit_message>
<xml_diff>
--- a/paper2-catalog/statya2_ru.docx
+++ b/paper2-catalog/statya2_ru.docx
@@ -117,7 +117,7 @@
         </w:rPr>
         <w:t xml:space="preserve">ORCID: </w:t>
       </w:r>
-      <w:hyperlink w:history="1" r:id="rIdfyqjrkwhs_dqlvoqf6k_q">
+      <w:hyperlink w:history="1" r:id="rIdndudflhd-ficam8nwrffh">
         <w:r>
           <w:rPr>
             <w:rStyle w:val="Hyperlink"/>
@@ -450,6 +450,30 @@
           <w:szCs w:val="24"/>
         </w:rPr>
         <w:t xml:space="preserve">Раздел 2 рассматривает соответствующий ландшафт стандартов. Раздел 3 описывает устройство каталога. Раздел 4 определяет методологию пакетов соответствия. Раздел 5 поочерёдно представляет каждый из шести пакетов. Раздел 6 предоставляет кросс-уолк к IEEE P3109. Раздел 7 обсуждает интерпретационный разрыв как проектную особенность. Раздел 8 охватывает воспроизводимость и происхождение. Раздел 9 намечает будущую работу. Раздел 10 формулирует ограничения.</w:t>
+      </w:r>
+    </w:p>
+    <w:p>
+      <w:pPr>
+        <w:spacing w:after="140" w:line="276"/>
+        <w:jc w:val="both"/>
+      </w:pPr>
+      <w:r>
+        <w:rPr>
+          <w:rFonts w:ascii="Times New Roman" w:cs="Times New Roman" w:eastAsia="Times New Roman" w:hAnsi="Times New Roman"/>
+          <w:b/>
+          <w:bCs/>
+          <w:sz w:val="24"/>
+          <w:szCs w:val="24"/>
+        </w:rPr>
+        <w:t xml:space="preserve">Историческая преемственность. </w:t>
+      </w:r>
+      <w:r>
+        <w:rPr>
+          <w:rFonts w:ascii="Times New Roman" w:cs="Times New Roman" w:eastAsia="Times New Roman" w:hAnsi="Times New Roman"/>
+          <w:sz w:val="24"/>
+          <w:szCs w:val="24"/>
+        </w:rPr>
+        <w:t xml:space="preserve">Один из шести пакетов соответствия — GoldenFloat 16 (GF16) — относится к отечественной линии исследований оригинальных систем представления чисел, начатой троичной ЭВМ «Сетунь» под руководством Н. П. Брусенцова (Вычислительный центр МГУ, 1958) — первой в мире машиной на симметричном троичном коде (−1, 0, +1), а в «Сетунь-70» (1970) — с введённым троичным форматом «трайт» и оптимизированным диапазоном мантиссы нормализованного числа. По доступным открытым источникам, GF16 — один из первых именованных числовых форматов российского авторства, доведённых до уровня публикации и аппаратной реализации (FPGA).</w:t>
       </w:r>
     </w:p>
     <w:p>

</xml_diff>

<commit_message>
Fix catalog count 84->83 (verified vs t27 SSOT, #1064); merge title page into single docx; unify email to admin@t27.ai; fix pdfauthor metadata
</commit_message>
<xml_diff>
--- a/paper2-catalog/statya2_ru.docx
+++ b/paper2-catalog/statya2_ru.docx
@@ -4,6 +4,65 @@
   <w:body>
     <w:p>
       <w:pPr>
+        <w:spacing w:after="40" w:line="360"/>
+        <w:jc w:val="left"/>
+      </w:pPr>
+      <w:r>
+        <w:rPr>
+          <w:rFonts w:ascii="Times New Roman" w:cs="Times New Roman" w:eastAsia="Times New Roman" w:hAnsi="Times New Roman"/>
+          <w:i/>
+          <w:iCs/>
+          <w:sz w:val="22"/>
+          <w:szCs w:val="22"/>
+        </w:rPr>
+        <w:t xml:space="preserve">В редакцию журнала «Искусственный интеллект и принятие решений»</w:t>
+      </w:r>
+    </w:p>
+    <w:p>
+      <w:pPr>
+        <w:spacing w:after="40" w:line="360"/>
+        <w:jc w:val="left"/>
+      </w:pPr>
+      <w:r>
+        <w:rPr>
+          <w:rFonts w:ascii="Times New Roman" w:cs="Times New Roman" w:eastAsia="Times New Roman" w:hAnsi="Times New Roman"/>
+          <w:sz w:val="20"/>
+          <w:szCs w:val="20"/>
+        </w:rPr>
+        <w:t xml:space="preserve">ФИЦ «Информатика и управление» РАН · научная специальность 1.2.1</w:t>
+      </w:r>
+    </w:p>
+    <w:p>
+      <w:pPr>
+        <w:spacing w:after="40" w:line="360"/>
+        <w:jc w:val="left"/>
+      </w:pPr>
+      <w:r>
+        <w:rPr>
+          <w:rFonts w:ascii="Times New Roman" w:cs="Times New Roman" w:eastAsia="Times New Roman" w:hAnsi="Times New Roman"/>
+          <w:sz w:val="20"/>
+          <w:szCs w:val="20"/>
+        </w:rPr>
+        <w:t xml:space="preserve">УДК 004.222</w:t>
+      </w:r>
+    </w:p>
+    <w:p>
+      <w:pPr>
+        <w:pBdr>
+          <w:bottom w:val="single" w:color="000000" w:sz="6" w:space="1"/>
+        </w:pBdr>
+        <w:spacing w:after="120" w:before="120"/>
+      </w:pPr>
+      <w:r>
+        <w:rPr>
+          <w:sz w:val="2"/>
+          <w:szCs w:val="2"/>
+        </w:rPr>
+        <w:t xml:space="preserve"/>
+      </w:r>
+    </w:p>
+    <w:p>
+      <w:pPr>
         <w:spacing w:after="80" w:before="200"/>
         <w:jc w:val="center"/>
       </w:pPr>
@@ -15,7 +74,7 @@
           <w:sz w:val="32"/>
           <w:szCs w:val="32"/>
         </w:rPr>
-        <w:t xml:space="preserve">Каталог из 84 численных форматов с битоточными векторами соответствия:</w:t>
+        <w:t xml:space="preserve">Каталог из 83 численных форматов с битоточными векторами соответствия:</w:t>
       </w:r>
     </w:p>
     <w:p>
@@ -85,7 +144,7 @@
           <w:sz w:val="20"/>
           <w:szCs w:val="20"/>
         </w:rPr>
-        <w:t xml:space="preserve">dao999nft@gmail.com</w:t>
+        <w:t xml:space="preserve">admin@t27.ai</w:t>
       </w:r>
       <w:r>
         <w:rPr>
@@ -117,7 +176,7 @@
         </w:rPr>
         <w:t xml:space="preserve">ORCID: </w:t>
       </w:r>
-      <w:hyperlink w:history="1" r:id="rIdp355jfwcvtbqcfe_hzla9">
+      <w:hyperlink w:history="1" r:id="rIdtqwult95kkcnzfnaowwpw">
         <w:r>
           <w:rPr>
             <w:rStyle w:val="Hyperlink"/>
@@ -188,7 +247,7 @@
           <w:sz w:val="22"/>
           <w:szCs w:val="22"/>
         </w:rPr>
-        <w:t xml:space="preserve">В настоящей статье описаны: каталог из 84 численных форматов, охватывающий 13 семейств; набор из шести битоточных пакетов соответствия (conformance packs) для GF16, элемента MXFP4, BF16, FP8 E4M3, FP8 E5M2 и блочного масштаба E8M0; а также кросс-уолк к IEEE P3109 v3.2.0, сопоставляющий каждый пакет с соответствующей конфигурируемой формой стандарта. Каждый пакет представляет собой самодостаточный документ JSON с отпечатком SHA-256, общей схемой строк и якорным вектором, кодирующим значение 3,0 — тождество </w:t>
+        <w:t xml:space="preserve">В настоящей статье описаны: каталог из 83 численных форматов, охватывающий 13 семейств; набор из шести битоточных пакетов соответствия (conformance packs) для GF16, элемента MXFP4, BF16, FP8 E4M3, FP8 E5M2 и блочного масштаба E8M0; а также кросс-уолк к IEEE P3109 v3.2.0, сопоставляющий каждый пакет с соответствующей конфигурируемой формой стандарта. Каждый пакет представляет собой самодостаточный документ JSON с отпечатком SHA-256, общей схемой строк и якорным вектором, кодирующим значение 3,0 — тождество </w:t>
       </w:r>
       <w:r>
         <w:rPr>
@@ -279,7 +338,7 @@
           <w:sz w:val="28"/>
           <w:szCs w:val="28"/>
         </w:rPr>
-        <w:t xml:space="preserve">An 84-format numeric catalog with bit-exact conformance vectors:</w:t>
+        <w:t xml:space="preserve">An 83-format numeric catalog with bit-exact conformance vectors:</w:t>
       </w:r>
     </w:p>
     <w:p>
@@ -357,7 +416,7 @@
           <w:sz w:val="22"/>
           <w:szCs w:val="22"/>
         </w:rPr>
-        <w:t xml:space="preserve">The proliferation of numeric formats in machine-learning hardware — FP8 (E4M3 and E5M2), BF16, MXFP4, block microscaling formats and dozens of research variants — has outpaced the availability of vendor-neutral, bit-exact reference material. This paper presents: a catalog of 84 numeric formats spanning 13 families; a set of six bit-exact conformance packs for GF16, the MXFP4 element, BF16, FP8 E4M3, FP8 E5M2 and the E8M0 block scale; and a crosswalk to IEEE P3109 v3.2.0 mapping each pack to its configurable form of the standard. Every pack is a self-contained JSON document with a SHA-256 fingerprint, a shared row schema and an anchor vector encoding the value 3.0 — the identity phi^2 + 1/phi^2 = 3 — as a cross-pack correctness check. Packs are cross-checked against ml_dtypes 0.5.4 (Google/JAX); any discrepancy is documented explicitly and interpreted as a specification-permitted interpretive gap rather than hidden. The work is positioned as registry-filling: it proposes no new formats, makes no model-accuracy claim and asserts no superiority over any vendor implementation. All artefacts are publicly available at github.com/gHashTag/t27 under an open license.</w:t>
+        <w:t xml:space="preserve">The proliferation of numeric formats in machine-learning hardware — FP8 (E4M3 and E5M2), BF16, MXFP4, block microscaling formats and dozens of research variants — has outpaced the availability of vendor-neutral, bit-exact reference material. This paper presents: a catalog of 83 numeric formats spanning 13 families; a set of six bit-exact conformance packs for GF16, the MXFP4 element, BF16, FP8 E4M3, FP8 E5M2 and the E8M0 block scale; and a crosswalk to IEEE P3109 v3.2.0 mapping each pack to its configurable form of the standard. Every pack is a self-contained JSON document with a SHA-256 fingerprint, a shared row schema and an anchor vector encoding the value 3.0 — the identity phi^2 + 1/phi^2 = 3 — as a cross-pack correctness check. Packs are cross-checked against ml_dtypes 0.5.4 (Google/JAX); any discrepancy is documented explicitly and interpreted as a specification-permitted interpretive gap rather than hidden. The work is positioned as registry-filling: it proposes no new formats, makes no model-accuracy claim and asserts no superiority over any vendor implementation. All artefacts are publicly available at github.com/gHashTag/t27 under an open license.</w:t>
       </w:r>
     </w:p>
     <w:p>
@@ -382,6 +441,45 @@
           <w:szCs w:val="22"/>
         </w:rPr>
         <w:t xml:space="preserve">numeric formats, floating point, conformance, IEEE P3109, golden ratio, machine learning, bit-exact vectors, microscaling, FP8, BF16, MXFP4.</w:t>
+      </w:r>
+    </w:p>
+    <w:p>
+      <w:pPr>
+        <w:pBdr>
+          <w:bottom w:val="single" w:color="000000" w:sz="6" w:space="1"/>
+        </w:pBdr>
+        <w:spacing w:after="120" w:before="120"/>
+      </w:pPr>
+      <w:r>
+        <w:rPr>
+          <w:sz w:val="2"/>
+          <w:szCs w:val="2"/>
+        </w:rPr>
+        <w:t xml:space="preserve"/>
+      </w:r>
+    </w:p>
+    <w:p>
+      <w:pPr>
+        <w:spacing w:after="120" w:line="360"/>
+        <w:jc w:val="both"/>
+      </w:pPr>
+      <w:r>
+        <w:rPr>
+          <w:rFonts w:ascii="Times New Roman" w:cs="Times New Roman" w:eastAsia="Times New Roman" w:hAnsi="Times New Roman"/>
+          <w:b/>
+          <w:bCs/>
+          <w:sz w:val="20"/>
+          <w:szCs w:val="20"/>
+        </w:rPr>
+        <w:t xml:space="preserve">Сведения для редакции. </w:t>
+      </w:r>
+      <w:r>
+        <w:rPr>
+          <w:rFonts w:ascii="Times New Roman" w:cs="Times New Roman" w:eastAsia="Times New Roman" w:hAnsi="Times New Roman"/>
+          <w:sz w:val="20"/>
+          <w:szCs w:val="20"/>
+        </w:rPr>
+        <w:t xml:space="preserve">Статья оригинальна, ранее не публиковалась и не подавалась в другие издания. Конфликт интересов отсутствует, внешнее финансирование не привлекалось. Рукопись оформлена единым файлом MS Word (.docx) и содержит русско- и англоязычные версии названия, сведений об авторе, аннотации и ключевых слов; текст чёрно-белый, формат А4. По требованию редакции автор готов предоставить лицензионный договор (скан) и экспертное заключение о возможности открытого опубликования. Тема письма при подаче: «ИИПР Васильев». Контактная эл. почта: admin@t27.ai.</w:t>
       </w:r>
     </w:p>
     <w:p>
@@ -445,7 +543,7 @@
           <w:sz w:val="22"/>
           <w:szCs w:val="22"/>
         </w:rPr>
-        <w:t xml:space="preserve">Вклад 1: каталог из 84 численных форматов. </w:t>
+        <w:t xml:space="preserve">Вклад 1: каталог из 83 численных форматов. </w:t>
       </w:r>
       <w:r>
         <w:rPr>
@@ -469,7 +567,7 @@
           <w:sz w:val="22"/>
           <w:szCs w:val="22"/>
         </w:rPr>
-        <w:t xml:space="preserve"> перечисляет 84 численных формата в 13 семействах (раздел 3). Каждая запись несёт единообразную схему: разрядную раскладку, смещение порядка (bias), политику бесконечности/NaN, политику насыщения, максимальное конечное значение, минимальное нормальное значение, минимальное субнормальное число и метку статуса утверждения (Verified / Empirical_fit / Open_conjecture / Risk / Retracted). Каталог хранится как единый источник истины и кросс-компилируется в Markdown, JSON, Python, Rust, C и TypeScript посредством шаблонного инструмента.</w:t>
+        <w:t xml:space="preserve"> перечисляет 83 численных формата в 13 семействах (раздел 3). Каждая запись несёт единообразную схему: разрядную раскладку, смещение порядка (bias), политику бесконечности/NaN, политику насыщения, максимальное конечное значение, минимальное нормальное значение, минимальное субнормальное число и метку статуса утверждения (Verified / Empirical_fit / Open_conjecture / Risk / Retracted). Каталог хранится как единый источник истины и кросс-компилируется в Markdown, JSON, Python, Rust, C и TypeScript посредством шаблонного инструмента.</w:t>
       </w:r>
     </w:p>
     <w:p>
@@ -1056,7 +1154,7 @@
           <w:sz w:val="26"/>
           <w:szCs w:val="26"/>
         </w:rPr>
-        <w:t xml:space="preserve">3.1. 84 формата в 13 кластерах</w:t>
+        <w:t xml:space="preserve">3.1. 83 формата в 13 кластерах</w:t>
       </w:r>
     </w:p>
     <w:p>
@@ -1087,7 +1185,7 @@
           <w:sz w:val="22"/>
           <w:szCs w:val="22"/>
         </w:rPr>
-        <w:t xml:space="preserve"> содержит 84 формата, организованных в 13 именованных кластеров. Таблица 1 показывает названия кластеров и количество форматов. Сумма количеств равна ровно 84; это непрерывно контролируемый инвариант каталога (CI-01, раздел 3.4).</w:t>
+        <w:t xml:space="preserve"> содержит 83 формата, организованных в 13 именованных кластеров. Таблица 1 показывает названия кластеров и количество форматов. Сумма количеств равна ровно 83; это непрерывно контролируемый инвариант каталога (CI-01, раздел 3.4).</w:t>
       </w:r>
     </w:p>
     <w:tbl>
@@ -1273,7 +1371,7 @@
                 <w:sz w:val="20"/>
                 <w:szCs w:val="20"/>
               </w:rPr>
-              <w:t xml:space="preserve">binary16, binary32, binary64, binary128, binary80</w:t>
+              <w:t xml:space="preserve">binary16, binary32, binary64, binary128, binary256</w:t>
             </w:r>
           </w:p>
         </w:tc>
@@ -1432,7 +1530,7 @@
                 <w:sz w:val="20"/>
                 <w:szCs w:val="20"/>
               </w:rPr>
-              <w:t xml:space="preserve">MLLowPrecision</w:t>
+              <w:t xml:space="preserve">Extended</w:t>
             </w:r>
           </w:p>
         </w:tc>
@@ -1463,7 +1561,7 @@
                 <w:sz w:val="20"/>
                 <w:szCs w:val="20"/>
               </w:rPr>
-              <w:t xml:space="preserve">BF16, TF32, FP8 E4M3, FP8 E5M2, FP8 E3M4, FP6, FP4, NF4</w:t>
+              <w:t xml:space="preserve">x87 FP80, double-double, quad-double</w:t>
             </w:r>
           </w:p>
         </w:tc>
@@ -1494,7 +1592,7 @@
                 <w:sz w:val="20"/>
                 <w:szCs w:val="20"/>
               </w:rPr>
-              <w:t xml:space="preserve">8</w:t>
+              <w:t xml:space="preserve">3</w:t>
             </w:r>
           </w:p>
         </w:tc>
@@ -1527,7 +1625,7 @@
                 <w:sz w:val="20"/>
                 <w:szCs w:val="20"/>
               </w:rPr>
-              <w:t xml:space="preserve">GoldenFloat</w:t>
+              <w:t xml:space="preserve">ML low-precision</w:t>
             </w:r>
           </w:p>
         </w:tc>
@@ -1558,7 +1656,7 @@
                 <w:sz w:val="20"/>
                 <w:szCs w:val="20"/>
               </w:rPr>
-              <w:t xml:space="preserve">GF4 … GF256 (варианты с привязкой к φ)</w:t>
+              <w:t xml:space="preserve">BF16, TF32, FP8 E4M3, FP8 E5M2, FP6 E3M2/E2M3, FP4 E2M1</w:t>
             </w:r>
           </w:p>
         </w:tc>
@@ -1589,7 +1687,7 @@
                 <w:sz w:val="20"/>
                 <w:szCs w:val="20"/>
               </w:rPr>
-              <w:t xml:space="preserve">16</w:t>
+              <w:t xml:space="preserve">7</w:t>
             </w:r>
           </w:p>
         </w:tc>
@@ -1622,7 +1720,7 @@
                 <w:sz w:val="20"/>
                 <w:szCs w:val="20"/>
               </w:rPr>
-              <w:t xml:space="preserve">Posit / Unum III</w:t>
+              <w:t xml:space="preserve">Microscaling (MX)</w:t>
             </w:r>
           </w:p>
         </w:tc>
@@ -1653,7 +1751,7 @@
                 <w:sz w:val="20"/>
                 <w:szCs w:val="20"/>
               </w:rPr>
-              <w:t xml:space="preserve">Posit8, Posit16, Posit32, takum8, takum16, …</w:t>
+              <w:t xml:space="preserve">MXFP8, MXFP6, MXFP4</w:t>
             </w:r>
           </w:p>
         </w:tc>
@@ -1684,7 +1782,7 @@
                 <w:sz w:val="20"/>
                 <w:szCs w:val="20"/>
               </w:rPr>
-              <w:t xml:space="preserve">8</w:t>
+              <w:t xml:space="preserve">3</w:t>
             </w:r>
           </w:p>
         </w:tc>
@@ -1717,7 +1815,7 @@
                 <w:sz w:val="20"/>
                 <w:szCs w:val="20"/>
               </w:rPr>
-              <w:t xml:space="preserve">OCP MX</w:t>
+              <w:t xml:space="preserve">Posit / Unum III</w:t>
             </w:r>
           </w:p>
         </w:tc>
@@ -1748,7 +1846,7 @@
                 <w:sz w:val="20"/>
                 <w:szCs w:val="20"/>
               </w:rPr>
-              <w:t xml:space="preserve">MXFP4, MXFP6_E2M3, MXFP6_E3M2, MXFP8_E4M3, E8M0_block</w:t>
+              <w:t xml:space="preserve">Posit8/16/32/64, takum8/16/32/64</w:t>
             </w:r>
           </w:p>
         </w:tc>
@@ -1779,7 +1877,7 @@
                 <w:sz w:val="20"/>
                 <w:szCs w:val="20"/>
               </w:rPr>
-              <w:t xml:space="preserve">5</w:t>
+              <w:t xml:space="preserve">8</w:t>
             </w:r>
           </w:p>
         </w:tc>
@@ -1843,7 +1941,7 @@
                 <w:sz w:val="20"/>
                 <w:szCs w:val="20"/>
               </w:rPr>
-              <w:t xml:space="preserve">варианты LNS8, LNS16</w:t>
+              <w:t xml:space="preserve">LNS-8, LNS-16, LNS-32, LNS-64</w:t>
             </w:r>
           </w:p>
         </w:tc>
@@ -1907,7 +2005,7 @@
                 <w:sz w:val="20"/>
                 <w:szCs w:val="20"/>
               </w:rPr>
-              <w:t xml:space="preserve">IntegerFixed</w:t>
+              <w:t xml:space="preserve">GoldenFloat</w:t>
             </w:r>
           </w:p>
         </w:tc>
@@ -1938,7 +2036,7 @@
                 <w:sz w:val="20"/>
                 <w:szCs w:val="20"/>
               </w:rPr>
-              <w:t xml:space="preserve">INT2, INT4, INT8, INT16, UINT4, UINT8, UINT16, FXP16</w:t>
+              <w:t xml:space="preserve">GFTernary, GF4 … GF1024 (с привязкой к φ), MXGF6/MXGF4</w:t>
             </w:r>
           </w:p>
         </w:tc>
@@ -1969,7 +2067,7 @@
                 <w:sz w:val="20"/>
                 <w:szCs w:val="20"/>
               </w:rPr>
-              <w:t xml:space="preserve">8</w:t>
+              <w:t xml:space="preserve">22</w:t>
             </w:r>
           </w:p>
         </w:tc>
@@ -2002,7 +2100,7 @@
                 <w:sz w:val="20"/>
                 <w:szCs w:val="20"/>
               </w:rPr>
-              <w:t xml:space="preserve">HistoricalVendor</w:t>
+              <w:t xml:space="preserve">IntegerFixed</w:t>
             </w:r>
           </w:p>
         </w:tc>
@@ -2033,7 +2131,7 @@
                 <w:sz w:val="20"/>
                 <w:szCs w:val="20"/>
               </w:rPr>
-              <w:t xml:space="preserve">IBM hex float, DEC VAX G, Cray single, NVIDIA TF32, …</w:t>
+              <w:t xml:space="preserve">INT4/8/16/32/64/128, Q-format, BCD</w:t>
             </w:r>
           </w:p>
         </w:tc>
@@ -2064,7 +2162,7 @@
                 <w:sz w:val="20"/>
                 <w:szCs w:val="20"/>
               </w:rPr>
-              <w:t xml:space="preserve">10</w:t>
+              <w:t xml:space="preserve">8</w:t>
             </w:r>
           </w:p>
         </w:tc>
@@ -2097,7 +2195,7 @@
                 <w:sz w:val="20"/>
                 <w:szCs w:val="20"/>
               </w:rPr>
-              <w:t xml:space="preserve">Theoretical</w:t>
+              <w:t xml:space="preserve">QuantTuned</w:t>
             </w:r>
           </w:p>
         </w:tc>
@@ -2128,7 +2226,7 @@
                 <w:sz w:val="20"/>
                 <w:szCs w:val="20"/>
               </w:rPr>
-              <w:t xml:space="preserve">граничные случаи E0M7, E7M0, E1M6, E6M1</w:t>
+              <w:t xml:space="preserve">NF4 (NormalFloat), AFP (Adaptive FP)</w:t>
             </w:r>
           </w:p>
         </w:tc>
@@ -2159,7 +2257,7 @@
                 <w:sz w:val="20"/>
                 <w:szCs w:val="20"/>
               </w:rPr>
-              <w:t xml:space="preserve">4</w:t>
+              <w:t xml:space="preserve">2</w:t>
             </w:r>
           </w:p>
         </w:tc>
@@ -2223,7 +2321,7 @@
                 <w:sz w:val="20"/>
                 <w:szCs w:val="20"/>
               </w:rPr>
-              <w:t xml:space="preserve">NF4 block, E8M0 block, SF8, RFP8</w:t>
+              <w:t xml:space="preserve">block FP (BFP), shared-exponent, INT8 per-channel, stochastic rounding</w:t>
             </w:r>
           </w:p>
         </w:tc>
@@ -2287,7 +2385,7 @@
                 <w:sz w:val="20"/>
                 <w:szCs w:val="20"/>
               </w:rPr>
-              <w:t xml:space="preserve">Extended</w:t>
+              <w:t xml:space="preserve">HistoricalVendor</w:t>
             </w:r>
           </w:p>
         </w:tc>
@@ -2318,7 +2416,7 @@
                 <w:sz w:val="20"/>
                 <w:szCs w:val="20"/>
               </w:rPr>
-              <w:t xml:space="preserve">binary256, bfloat32, bfloat128</w:t>
+              <w:t xml:space="preserve">IBM HFP, Microsoft MBF, VAX F/D/G/H-float, Cray float</w:t>
             </w:r>
           </w:p>
         </w:tc>
@@ -2349,7 +2447,7 @@
                 <w:sz w:val="20"/>
                 <w:szCs w:val="20"/>
               </w:rPr>
-              <w:t xml:space="preserve">3</w:t>
+              <w:t xml:space="preserve">10</w:t>
             </w:r>
           </w:p>
         </w:tc>
@@ -2382,7 +2480,7 @@
                 <w:sz w:val="20"/>
                 <w:szCs w:val="20"/>
               </w:rPr>
-              <w:t xml:space="preserve">QuantTuned</w:t>
+              <w:t xml:space="preserve">Theoretical</w:t>
             </w:r>
           </w:p>
         </w:tc>
@@ -2413,7 +2511,7 @@
                 <w:sz w:val="20"/>
                 <w:szCs w:val="20"/>
               </w:rPr>
-              <w:t xml:space="preserve">Q-BF16, adaptive-FP8</w:t>
+              <w:t xml:space="preserve">minifloat, Unum I, Unum II (SORN), tapered FP</w:t>
             </w:r>
           </w:p>
         </w:tc>
@@ -2444,7 +2542,7 @@
                 <w:sz w:val="20"/>
                 <w:szCs w:val="20"/>
               </w:rPr>
-              <w:t xml:space="preserve">2</w:t>
+              <w:t xml:space="preserve">4</w:t>
             </w:r>
           </w:p>
         </w:tc>
@@ -2543,7 +2641,7 @@
                 <w:sz w:val="20"/>
                 <w:szCs w:val="20"/>
               </w:rPr>
-              <w:t xml:space="preserve">84</w:t>
+              <w:t xml:space="preserve">83</w:t>
             </w:r>
           </w:p>
         </w:tc>
@@ -2562,7 +2660,7 @@
           <w:sz w:val="20"/>
           <w:szCs w:val="20"/>
         </w:rPr>
-        <w:t xml:space="preserve">Таблица 1. 84 формата в 13 кластерах (T1).</w:t>
+        <w:t xml:space="preserve">Таблица 1. 83 формата в 13 кластерах (T1).</w:t>
       </w:r>
     </w:p>
     <w:p>
@@ -3369,7 +3467,7 @@
                 <w:sz w:val="19"/>
                 <w:szCs w:val="19"/>
               </w:rPr>
-              <w:t xml:space="preserve">Общее число форматов равно 84</w:t>
+              <w:t xml:space="preserve">Общее число форматов равно 83</w:t>
             </w:r>
           </w:p>
         </w:tc>
@@ -3400,7 +3498,7 @@
                 <w:sz w:val="22"/>
                 <w:szCs w:val="22"/>
               </w:rPr>
-              <w:t xml:space="preserve">sum(cluster_counts) == 84</w:t>
+              <w:t xml:space="preserve">sum(cluster_counts) == 83</w:t>
             </w:r>
           </w:p>
         </w:tc>
@@ -13342,7 +13440,7 @@
           <w:sz w:val="26"/>
           <w:szCs w:val="26"/>
         </w:rPr>
-        <w:t xml:space="preserve">9.1. Трек 2: полный набор из 84 пакетов</w:t>
+        <w:t xml:space="preserve">9.1. Трек 2: полный набор из 83 пакетов</w:t>
       </w:r>
     </w:p>
     <w:p>
@@ -13357,7 +13455,7 @@
           <w:sz w:val="22"/>
           <w:szCs w:val="22"/>
         </w:rPr>
-        <w:t xml:space="preserve">Шесть пакетов в этой статье охватывают форматы, наиболее немедленно релевантные промышленному ML-оборудованию. Трек 2 (целевой срок III кв. 2026) расширит охват на все 84 формата каталога, для которых доступны эталонные реализации, включая:</w:t>
+        <w:t xml:space="preserve">Шесть пакетов в этой статье охватывают форматы, наиболее немедленно релевантные промышленному ML-оборудованию. Трек 2 (целевой срок III кв. 2026) расширит охват на все 83 формата каталога, для которых доступны эталонные реализации, включая:</w:t>
       </w:r>
     </w:p>
     <w:p>
@@ -13888,7 +13986,7 @@
           <w:sz w:val="22"/>
           <w:szCs w:val="22"/>
         </w:rPr>
-        <w:t xml:space="preserve">Каталог из 84 строк (раздел 3) охватывает 13 кластеров форматов, но глубина покрытия неравномерна. IEEE 754 binary, BF16, FP8 (E4M3/E5M2), MXFP4 и семейство GoldenFloat GFN покрыты полными схемами строк, таксономией статусов утверждений и соответствующими пакетами Tier-1, где применимо. Строки Posit/Unum III, логарифмические системы счисления (LNS), NF4, BitNet, TF32 и FP6 присутствуют, но в настоящее время лишены пакетов Tier-1; их поля статуса утверждений заполнены, но ещё не проверены сквозным образом относительно оракула. Это сделано намеренно — каталог в первую очередь реестр, а во вторую — стенд верификации — но это означает, что отсутствие пакета соответствия не следует трактовать как утверждение о качестве.</w:t>
+        <w:t xml:space="preserve">Каталог из 83 строк (раздел 3) охватывает 13 кластеров форматов, но глубина покрытия неравномерна. IEEE 754 binary, BF16, FP8 (E4M3/E5M2), MXFP4 и семейство GoldenFloat GFN покрыты полными схемами строк, таксономией статусов утверждений и соответствующими пакетами Tier-1, где применимо. Строки Posit/Unum III, логарифмические системы счисления (LNS), NF4, BitNet, TF32 и FP6 присутствуют, но в настоящее время лишены пакетов Tier-1; их поля статуса утверждений заполнены, но ещё не проверены сквозным образом относительно оракула. Это сделано намеренно — каталог в первую очередь реестр, а во вторую — стенд верификации — но это означает, что отсутствие пакета соответствия не следует трактовать как утверждение о качестве.</w:t>
       </w:r>
     </w:p>
     <w:p>
@@ -14029,7 +14127,7 @@
           <w:sz w:val="22"/>
           <w:szCs w:val="22"/>
         </w:rPr>
-        <w:t xml:space="preserve">Результаты этой статьи — каталог из 84 форматов, шесть пакетов соответствия, кросс-уолк к P3109 v3.2.0 и два задокументированных интерпретационных разрыва — зависят только от артефактов, процитированных в библиографии и публично доступных (репозитории с открытой лицензией, опубликованные стандарты и препринт arXiv GoldenFloat). Ни одно утверждение, таблица или теорема в этой статье не опирается на неопубликованные или находящиеся на рецензировании рукописи. Предстоящие последующие работы по смежным темам упоминаются только как направление будущей работы в разделе 9 и явно выходят за рамки настоящего изложения.</w:t>
+        <w:t xml:space="preserve">Результаты этой статьи — каталог из 83 форматов, шесть пакетов соответствия, кросс-уолк к P3109 v3.2.0 и два задокументированных интерпретационных разрыва — зависят только от артефактов, процитированных в библиографии и публично доступных (репозитории с открытой лицензией, опубликованные стандарты и препринт arXiv GoldenFloat). Ни одно утверждение, таблица или теорема в этой статье не опирается на неопубликованные или находящиеся на рецензировании рукописи. Предстоящие последующие работы по смежным темам упоминаются только как направление будущей работы в разделе 9 и явно выходят за рамки настоящего изложения.</w:t>
       </w:r>
     </w:p>
     <w:p>
@@ -14044,7 +14142,7 @@
           <w:sz w:val="22"/>
           <w:szCs w:val="22"/>
         </w:rPr>
-        <w:t xml:space="preserve">Ни одно из этих ограничений не меняет центрального утверждения статьи: каталог из 84 форматов с шестью пакетами соответствия, кросс-уолком к IEEE P3109 и двумя задокументированными интерпретационными разрывами теперь является пригодным, воспроизводимым вендор-нейтральным справочником. Они очерчивают то, чем артефакт является, в отличие от того, чем он не является.</w:t>
+        <w:t xml:space="preserve">Ни одно из этих ограничений не меняет центрального утверждения статьи: каталог из 83 форматов с шестью пакетами соответствия, кросс-уолком к IEEE P3109 и двумя задокументированными интерпретационными разрывами теперь является пригодным, воспроизводимым вендор-нейтральным справочником. Они очерчивают то, чем артефакт является, в отличие от того, чем он не является.</w:t>
       </w:r>
     </w:p>
     <w:p>
@@ -14648,7 +14746,7 @@
           <w:sz w:val="22"/>
           <w:szCs w:val="22"/>
         </w:rPr>
-        <w:t xml:space="preserve">— независимый исследователь (Trinity S³AI), г. Ко Самуи, Королевство Таиланд. Область научных интересов: численные форматы, арифметика пониженной точности, нейросимвольный ИИ, верифицируемые вычисления. ORCID: 0009-0008-4294-6159. Эл. почта: dao999nft@gmail.com.</w:t>
+        <w:t xml:space="preserve">— независимый исследователь (Trinity S³AI), г. Ко Самуи, Королевство Таиланд. Область научных интересов: численные форматы, арифметика пониженной точности, нейросимвольный ИИ, верифицируемые вычисления. ORCID: 0009-0008-4294-6159. Эл. почта: admin@t27.ai.</w:t>
       </w:r>
     </w:p>
     <w:p>
@@ -14672,7 +14770,7 @@
           <w:sz w:val="22"/>
           <w:szCs w:val="22"/>
         </w:rPr>
-        <w:t xml:space="preserve">— independent researcher (Trinity S³AI), Ko Samui, Kingdom of Thailand. Research interests: numeric formats, low-precision arithmetic, neurosymbolic AI, verifiable computing. ORCID: 0009-0008-4294-6159. E-mail: dao999nft@gmail.com.</w:t>
+        <w:t xml:space="preserve">— independent researcher (Trinity S³AI), Ko Samui, Kingdom of Thailand. Research interests: numeric formats, low-precision arithmetic, neurosymbolic AI, verifiable computing. ORCID: 0009-0008-4294-6159. E-mail: admin@t27.ai.</w:t>
       </w:r>
     </w:p>
     <w:sectPr>

</xml_diff>

<commit_message>
Deep editorial pass on both papers (RU+EN)
Paper 1 (GoldenFloat):
- Corona section: clarify chip ROM encodes 80-record snapshot (subset),
  distinct from the 83-format SSOT catalog; 17 Tier-1 decoders cover
  18 format families (FP8 E4M3 reuses MXFP8 E4M3 decoder)
- Fix FPGA board: XC7A35T -> XC7A100T (QMTech Wukong V1, verified silicon)
- 50 -> 51 directed tests (per tt-trinity-corona README)

Paper 2 (catalog):
- Reword MXFP4 element pack sentence for clarity (12 vectors)

Verified vs gHashTag/t27 and gHashTag/tt-trinity-corona sources.
</commit_message>
<xml_diff>
--- a/paper2-catalog/statya2_ru.docx
+++ b/paper2-catalog/statya2_ru.docx
@@ -176,7 +176,7 @@
         </w:rPr>
         <w:t xml:space="preserve">ORCID: </w:t>
       </w:r>
-      <w:hyperlink w:history="1" r:id="rIdtqwult95kkcnzfnaowwpw">
+      <w:hyperlink w:history="1" r:id="rIddhgatktl6tapourjrac6t">
         <w:r>
           <w:rPr>
             <w:rStyle w:val="Hyperlink"/>
@@ -8090,7 +8090,7 @@
           <w:sz w:val="22"/>
           <w:szCs w:val="22"/>
         </w:rPr>
-        <w:t xml:space="preserve">Элемент MXFP4 использует раскладку S1E2M1 (1 бит знака, 2 бита порядка, 1 бит мантиссы) с политикой переполнения «насыщение до конечного», как указано в OCP MX v1.0. В пределах блока 32 таких элемента разделяют масштабный множитель E8M0. Пакет элемента охватывает 12 векторов: 15 представимых конечных значений плюс нуль и случай насыщения. На момент написания ml_dtypes не предоставляет тип элемента MXFP4; пакет верифицируется самопроверкой циклическим кодированием-декодированием и сравнивается с таблицей значений OCP MX v1.0. SHA-256: </w:t>
+        <w:t xml:space="preserve">Элемент MXFP4 использует раскладку S1E2M1 (1 бит знака, 2 бита порядка, 1 бит мантиссы) с политикой переполнения «насыщение до конечного», как указано в OCP MX v1.0. В пределах блока 32 таких элемента разделяют масштабный множитель E8M0. Пакет элемента охватывает 12 векторов, выбранных из представимых конечных значений элемента, включая нуль и случай насыщения. На момент написания ml_dtypes не предоставляет тип элемента MXFP4; пакет верифицируется самопроверкой циклическим кодированием-декодированием и сравнивается с таблицей значений OCP MX v1.0. SHA-256: </w:t>
       </w:r>
       <w:r>
         <w:rPr>

</xml_diff>

<commit_message>
paper2: reframe deliverable as catalog-wide conformance set (all 83 formats)
Update Statya 2 to reflect the full conformance-pack set: 49 bit-exact
+ 34 structural packs covering all 83 catalog formats, with the six
ml_dtypes-cross-checked packs reframed as a deeply-validated Tier-1
reference subset.

- RU/EN abstracts, contribution 2, structure paragraph, historical
  continuity: full-set framing + Tier-1 subset.
- Section 2.3 (Разрыв): registry gap filled catalog-wide.
- Section 4.3 anchor: 43/49 exact; 6 honest exceptions documented.
- New Section 4.5: coverage policy for all 83 formats + INDEX mention.
- Section 5 retitled; Section 8.1/8.5/9.1/9.2 reframed.
- Section 10 (Limitations): both central-claim sentences reframed to
  full 83-pack set + six Tier-1 packs.
- Rebuilt statya2_ru.docx and statya2_ru.pdf (25 pp), visually verified.
</commit_message>
<xml_diff>
--- a/paper2-catalog/statya2_ru.docx
+++ b/paper2-catalog/statya2_ru.docx
@@ -176,7 +176,7 @@
         </w:rPr>
         <w:t xml:space="preserve">ORCID: </w:t>
       </w:r>
-      <w:hyperlink w:history="1" r:id="rIddhgatktl6tapourjrac6t">
+      <w:hyperlink w:history="1" r:id="rIdnprhnecwfrgtug7o60czb">
         <w:r>
           <w:rPr>
             <w:rStyle w:val="Hyperlink"/>
@@ -247,7 +247,7 @@
           <w:sz w:val="22"/>
           <w:szCs w:val="22"/>
         </w:rPr>
-        <w:t xml:space="preserve">В настоящей статье описаны: каталог из 83 численных форматов, охватывающий 13 семейств; набор из шести битоточных пакетов соответствия (conformance packs) для GF16, элемента MXFP4, BF16, FP8 E4M3, FP8 E5M2 и блочного масштаба E8M0; а также кросс-уолк к IEEE P3109 v3.2.0, сопоставляющий каждый пакет с соответствующей конфигурируемой формой стандарта. Каждый пакет представляет собой самодостаточный документ JSON с отпечатком SHA-256, общей схемой строк и якорным вектором, кодирующим значение 3,0 — тождество </w:t>
+        <w:t xml:space="preserve">В настоящей статье описаны: каталог из 83 численных форматов, охватывающий 13 семейств; полный набор пакетов соответствия (conformance packs), покрывающий все 83 формата каталога (49 битоточных пакетов с круговой проверкой кодирования-декодирования и 34 структурных пакета для форматов без фиксированной раскладки S:E:M по основанию 2); углублённое референсное подмножество из шести пакетов уровня Tier-1 для GF16, элемента MXFP4, BF16, FP8 E4M3, FP8 E5M2 и блочного масштаба E8M0, перекрёстно проверенных относительно внешнего оракула; а также кросс-уолк к IEEE P3109 v3.2.0, сопоставляющий каждый пакет Tier-1 с соответствующей конфигурируемой формой стандарта. Каждый пакет представляет собой самодостаточный документ JSON с отпечатком SHA-256, общей схемой строк и якорным вектором, кодирующим значение 3,0 — тождество </w:t>
       </w:r>
       <w:r>
         <w:rPr>
@@ -265,7 +265,7 @@
           <w:sz w:val="22"/>
           <w:szCs w:val="22"/>
         </w:rPr>
-        <w:t xml:space="preserve"> — в качестве межпакетной проверки корректности. Пакеты перекрёстно проверяются относительно </w:t>
+        <w:t xml:space="preserve"> — в качестве межпакетной проверки корректности. Пакеты подмножества Tier-1 перекрёстно проверяются относительно </w:t>
       </w:r>
       <w:r>
         <w:rPr>
@@ -338,7 +338,7 @@
           <w:sz w:val="28"/>
           <w:szCs w:val="28"/>
         </w:rPr>
-        <w:t xml:space="preserve">An 83-format numeric catalog with bit-exact conformance vectors:</w:t>
+        <w:t xml:space="preserve">An 83-format numeric catalog with catalog-wide conformance vectors:</w:t>
       </w:r>
     </w:p>
     <w:p>
@@ -416,7 +416,7 @@
           <w:sz w:val="22"/>
           <w:szCs w:val="22"/>
         </w:rPr>
-        <w:t xml:space="preserve">The proliferation of numeric formats in machine-learning hardware — FP8 (E4M3 and E5M2), BF16, MXFP4, block microscaling formats and dozens of research variants — has outpaced the availability of vendor-neutral, bit-exact reference material. This paper presents: a catalog of 83 numeric formats spanning 13 families; a set of six bit-exact conformance packs for GF16, the MXFP4 element, BF16, FP8 E4M3, FP8 E5M2 and the E8M0 block scale; and a crosswalk to IEEE P3109 v3.2.0 mapping each pack to its configurable form of the standard. Every pack is a self-contained JSON document with a SHA-256 fingerprint, a shared row schema and an anchor vector encoding the value 3.0 — the identity phi^2 + 1/phi^2 = 3 — as a cross-pack correctness check. Packs are cross-checked against ml_dtypes 0.5.4 (Google/JAX); any discrepancy is documented explicitly and interpreted as a specification-permitted interpretive gap rather than hidden. The work is positioned as registry-filling: it proposes no new formats, makes no model-accuracy claim and asserts no superiority over any vendor implementation. All artefacts are publicly available at github.com/gHashTag/t27 under an open license.</w:t>
+        <w:t xml:space="preserve">The proliferation of numeric formats in machine-learning hardware — FP8 (E4M3 and E5M2), BF16, MXFP4, block microscaling formats and dozens of research variants — has outpaced the availability of vendor-neutral, bit-exact reference material. This paper presents: a catalog of 83 numeric formats spanning 13 families; a complete conformance-pack set covering all 83 catalog formats (49 bit-exact packs with encode-decode round-trip checking and 34 structural packs for formats that have no fixed radix-2 S:E:M layout); a deeply validated Tier-1 reference subset of six packs for GF16, the MXFP4 element, BF16, FP8 E4M3, FP8 E5M2 and the E8M0 block scale, cross-checked against an external oracle; and a crosswalk to IEEE P3109 v3.2.0 mapping each Tier-1 pack to its configurable form of the standard. Every pack is a self-contained JSON document with a SHA-256 fingerprint, a shared row schema and an anchor vector encoding the value 3.0 — the identity phi^2 + 1/phi^2 = 3 — as a cross-pack correctness check. The Tier-1 packs are cross-checked against ml_dtypes 0.5.4 (Google/JAX); any discrepancy is documented explicitly and interpreted as a specification-permitted interpretive gap rather than hidden. The work is positioned as registry-filling: it proposes no new formats, makes no model-accuracy claim and asserts no superiority over any vendor implementation. All artefacts are publicly available at github.com/gHashTag/t27 under an open license.</w:t>
       </w:r>
     </w:p>
     <w:p>
@@ -584,15 +584,15 @@
           <w:sz w:val="22"/>
           <w:szCs w:val="22"/>
         </w:rPr>
-        <w:t xml:space="preserve">Вклад 2: шесть битоточных пакетов соответствия. </w:t>
-      </w:r>
-      <w:r>
-        <w:rPr>
-          <w:rFonts w:ascii="Times New Roman" w:cs="Times New Roman" w:eastAsia="Times New Roman" w:hAnsi="Times New Roman"/>
-          <w:sz w:val="22"/>
-          <w:szCs w:val="22"/>
-        </w:rPr>
-        <w:t xml:space="preserve">Пакеты (раздел 5) охватывают шесть форматов, наиболее часто встречающихся в современном промышленном аппаратном обеспечении и исследовательских конвейерах: GoldenFloat 16 (GF16), элемент MXFP4, BF16, FP8 E4M3, FP8 E5M2 и блочный масштаб E8M0. Два пакета (GF16 и MXFP4) уже доступны в PyPI-пакете </w:t>
+        <w:t xml:space="preserve">Вклад 2: полный набор пакетов соответствия на весь каталог. </w:t>
+      </w:r>
+      <w:r>
+        <w:rPr>
+          <w:rFonts w:ascii="Times New Roman" w:cs="Times New Roman" w:eastAsia="Times New Roman" w:hAnsi="Times New Roman"/>
+          <w:sz w:val="22"/>
+          <w:szCs w:val="22"/>
+        </w:rPr>
+        <w:t xml:space="preserve">Набор пакетов (раздел 5) покрывает все 83 формата каталога — по одному пакету на формат, без пропусков. Из них 49 пакетов битоточны (нативные биты декодируются в f64 точно, с проверкой кругового кодирования-декодирования), а 34 — структурны (форматы без единой фиксированной раскладки S:E:M по основанию 2 — параметрические, табличные, по основанию 16, тейперированно-логарифмические, расширенной точности или с открытыми ИОКР-параметрами), помеченные </w:t>
       </w:r>
       <w:r>
         <w:rPr>
@@ -600,6 +600,22 @@
           <w:sz w:val="22"/>
           <w:szCs w:val="22"/>
         </w:rPr>
+        <w:t xml:space="preserve">bitexact: false</w:t>
+      </w:r>
+      <w:r>
+        <w:rPr>
+          <w:rFonts w:ascii="Times New Roman" w:cs="Times New Roman" w:eastAsia="Times New Roman" w:hAnsi="Times New Roman"/>
+          <w:sz w:val="22"/>
+          <w:szCs w:val="22"/>
+        </w:rPr>
+        <w:t xml:space="preserve"> и несущие явное поле обоснования. Внутри этого набора выделено референсное подмножество из шести пакетов уровня Tier-1, наиболее часто встречающихся в современном промышленном оборудовании и дополнительно перекрёстно проверенных относительно внешнего оракула: GoldenFloat 16 (GF16), элемент MXFP4, BF16, FP8 E4M3, FP8 E5M2 и блочный масштаб E8M0 (раздел 5, таблица 4). Два из этих пакетов (GF16 и MXFP4) уже доступны в PyPI-пакете </w:t>
+      </w:r>
+      <w:r>
+        <w:rPr>
+          <w:rFonts w:ascii="Consolas" w:cs="Consolas" w:eastAsia="Consolas" w:hAnsi="Consolas"/>
+          <w:sz w:val="22"/>
+          <w:szCs w:val="22"/>
+        </w:rPr>
         <w:t xml:space="preserve">tt-lang-t27</w:t>
       </w:r>
       <w:r>
@@ -608,7 +624,7 @@
           <w:sz w:val="22"/>
           <w:szCs w:val="22"/>
         </w:rPr>
-        <w:t xml:space="preserve"> v0.3.1; остальные четыре представлены в текущем предварительном выпуске, доступном по адресу </w:t>
+        <w:t xml:space="preserve"> v0.3.1; остальные четыре пакета Tier-1 и полный каталоговый набор представлены в текущем предварительном выпуске по адресу </w:t>
       </w:r>
       <w:r>
         <w:rPr>
@@ -674,7 +690,7 @@
           <w:sz w:val="22"/>
           <w:szCs w:val="22"/>
         </w:rPr>
-        <w:t xml:space="preserve">Раздел 2 рассматривает соответствующий ландшафт стандартов. Раздел 3 описывает устройство каталога. Раздел 4 определяет методологию пакетов соответствия. Раздел 5 поочерёдно представляет каждый из шести пакетов. Раздел 6 предоставляет кросс-уолк к IEEE P3109. Раздел 7 обсуждает интерпретационный разрыв как проектную особенность. Раздел 8 охватывает воспроизводимость и происхождение. Раздел 9 намечает будущую работу. Раздел 10 формулирует ограничения.</w:t>
+        <w:t xml:space="preserve">Раздел 2 рассматривает соответствующий ландшафт стандартов. Раздел 3 описывает устройство каталога. Раздел 4 определяет методологию пакетов соответствия и политику покрытия всех 83 форматов. Раздел 5 представляет полный каталоговый набор и поочерёдно подробно разбирает шесть пакетов уровня Tier-1. Раздел 6 предоставляет кросс-уолк к IEEE P3109. Раздел 7 обсуждает интерпретационный разрыв как проектную особенность. Раздел 8 охватывает воспроизводимость и происхождение. Раздел 9 намечает будущую работу. Раздел 10 формулирует ограничения.</w:t>
       </w:r>
     </w:p>
     <w:p>
@@ -699,7 +715,7 @@
           <w:sz w:val="22"/>
           <w:szCs w:val="22"/>
         </w:rPr>
-        <w:t xml:space="preserve">Один из шести пакетов соответствия — GoldenFloat 16 (GF16) — относится к отечественной линии исследований оригинальных систем представления чисел, начатой троичной ЭВМ «Сетунь» под руководством Н. П. Брусенцова (Вычислительный центр МГУ, 1958) — первой в мире машиной на симметричном троичном коде (−1, 0, +1), а в «Сетунь-70» (1970) — с введённым троичным форматом «трайт» и оптимизированным диапазоном мантиссы нормализованного числа. По доступным открытым источникам, GF16 — один из первых именованных числовых форматов российского авторства, доведённых до уровня публикации и аппаратной реализации (FPGA).</w:t>
+        <w:t xml:space="preserve">Один из шести пакетов уровня Tier-1 — GoldenFloat 16 (GF16) — относится к отечественной линии исследований оригинальных систем представления чисел, начатой троичной ЭВМ «Сетунь» под руководством Н. П. Брусенцова (Вычислительный центр МГУ, 1958) — первой в мире машиной на симметричном троичном коде (−1, 0, +1), а в «Сетунь-70» (1970) — с введённым троичным форматом «трайт» и оптимизированным диапазоном мантиссы нормализованного числа. По доступным открытым источникам, GF16 — один из первых именованных числовых форматов российского авторства, доведённых до уровня публикации и аппаратной реализации (FPGA).</w:t>
       </w:r>
     </w:p>
     <w:p>
@@ -1120,7 +1136,7 @@
           <w:sz w:val="22"/>
           <w:szCs w:val="22"/>
         </w:rPr>
-        <w:t xml:space="preserve">Ни один отдельный вендор-нейтральный артефакт в настоящее время не охватывает FP8 E4M3, FP8 E5M2, BF16, элемент MXFP4, элемент NVFP4, GoldenFloat 16 и блочный масштаб E8M0 в единой схеме, обладая при этом: (а) битоточными векторами кодирования/декодирования; (б) происхождением, привязанным к SHA-256; (в) явной документацией каждого расхождения с эталонной реализацией; и (г) удобочитаемым кросс-уолком к IEEE P3109. Настоящая работа заполняет этот пробел реестра для шести наиболее немедленно развёртываемых пакетов уровня представления; NVFP4 обсуждается как ближайший кандидат «Трека 2» (раздел 9) и как второй интерпретационный разрыв (раздел 7).</w:t>
+        <w:t xml:space="preserve">Ни один отдельный вендор-нейтральный артефакт в настоящее время не охватывает FP8 E4M3, FP8 E5M2, BF16, элемент MXFP4, элемент NVFP4, GoldenFloat 16 и блочный масштаб E8M0 в единой схеме, обладая при этом: (а) битоточными векторами кодирования/декодирования; (б) происхождением, привязанным к SHA-256; (в) явной документацией каждого расхождения с эталонной реализацией; и (г) удобочитаемым кросс-уолком к IEEE P3109. Настоящая работа заполняет этот пробел реестра на уровне всего каталога: набор пакетов соответствия покрывает все 83 формата (49 битоточных + 34 структурных), а шесть наиболее немедленно развёртываемых форматов уровня представления выделены как углублённо проверенное подмножество Tier-1 (раздел 5); NVFP4 обсуждается как ближайший кандидат на включение в Tier-1 (раздел 9) и как второй интерпретационный разрыв (раздел 7).</w:t>
       </w:r>
     </w:p>
     <w:p>
@@ -6229,7 +6245,23 @@
           <w:sz w:val="22"/>
           <w:szCs w:val="22"/>
         </w:rPr>
-        <w:t xml:space="preserve">где φ = (1 + √5)/2 — золотое сечение. Это тождество представлено и контекстуализировано в препринте GoldenFloat как численно обоснованный L₂-якорь. Значение 3,0 точно представимо во всех шести форматах пакетов (оно попадает в нормальный диапазон с нулевой ошибкой мантиссы для всех шести раскладок), что делает его надёжной однострочной проверкой корректности между пакетами.</w:t>
+        <w:t xml:space="preserve">где φ = (1 + √5)/2 — золотое сечение. Это тождество представлено и контекстуализировано в препринте GoldenFloat как численно обоснованный L₂-якорь. Значение 3,0 точно представимо во всех шести форматах подмножества Tier-1 (оно попадает в нормальный диапазон с нулевой ошибкой мантиссы для всех шести раскладок), что делает его надёжной однострочной проверкой корректности между пакетами. В полном каталоговом наборе 3,0 точно попадает на сетку в 43 из 49 битоточных пакетов; шесть исключений (логарифмические LNS-8/16/32/64 и 4-битные GF4, MXGF4) честно фиксируют ближайшее представимое значение и истинную </w:t>
+      </w:r>
+      <w:r>
+        <w:rPr>
+          <w:rFonts w:ascii="Consolas" w:cs="Consolas" w:eastAsia="Consolas" w:hAnsi="Consolas"/>
+          <w:sz w:val="22"/>
+          <w:szCs w:val="22"/>
+        </w:rPr>
+        <w:t xml:space="preserve">abs_error</w:t>
+      </w:r>
+      <w:r>
+        <w:rPr>
+          <w:rFonts w:ascii="Times New Roman" w:cs="Times New Roman" w:eastAsia="Times New Roman" w:hAnsi="Times New Roman"/>
+          <w:sz w:val="22"/>
+          <w:szCs w:val="22"/>
+        </w:rPr>
+        <w:t xml:space="preserve">, поскольку log₂(3) не представим точно в LNS, а 4-битные сетки слишком грубы.</w:t>
       </w:r>
     </w:p>
     <w:p>
@@ -6402,6 +6434,219 @@
     </w:p>
     <w:p>
       <w:pPr>
+        <w:pStyle w:val="Heading2"/>
+        <w:spacing w:after="110" w:before="220"/>
+      </w:pPr>
+      <w:r>
+        <w:rPr>
+          <w:rFonts w:ascii="Times New Roman" w:cs="Times New Roman" w:eastAsia="Times New Roman" w:hAnsi="Times New Roman"/>
+          <w:b/>
+          <w:bCs/>
+          <w:color w:val="000000"/>
+          <w:sz w:val="26"/>
+          <w:szCs w:val="26"/>
+        </w:rPr>
+        <w:t xml:space="preserve">4.5. Политика покрытия всех 83 форматов</w:t>
+      </w:r>
+    </w:p>
+    <w:p>
+      <w:pPr>
+        <w:spacing w:after="120" w:line="360"/>
+        <w:ind w:firstLine="283"/>
+        <w:jc w:val="both"/>
+      </w:pPr>
+      <w:r>
+        <w:rPr>
+          <w:rFonts w:ascii="Times New Roman" w:cs="Times New Roman" w:eastAsia="Times New Roman" w:hAnsi="Times New Roman"/>
+          <w:sz w:val="22"/>
+          <w:szCs w:val="22"/>
+        </w:rPr>
+        <w:t xml:space="preserve">Набор пакетов покрывает весь каталог — по одному пакету на каждый из 83 форматов — по детерминированной и воспроизводимой политике:</w:t>
+      </w:r>
+    </w:p>
+    <w:p>
+      <w:pPr>
+        <w:pStyle w:val="ListParagraph"/>
+        <w:numPr>
+          <w:ilvl w:val="0"/>
+          <w:numId w:val="2"/>
+        </w:numPr>
+        <w:spacing w:after="80" w:line="276"/>
+        <w:jc w:val="both"/>
+      </w:pPr>
+      <w:r>
+        <w:rPr>
+          <w:rFonts w:ascii="Times New Roman" w:cs="Times New Roman" w:eastAsia="Times New Roman" w:hAnsi="Times New Roman"/>
+          <w:b/>
+          <w:bCs/>
+          <w:sz w:val="22"/>
+          <w:szCs w:val="22"/>
+        </w:rPr>
+        <w:t xml:space="preserve">Форматы ≤ 8 бит: </w:t>
+      </w:r>
+      <w:r>
+        <w:rPr>
+          <w:rFonts w:ascii="Times New Roman" w:cs="Times New Roman" w:eastAsia="Times New Roman" w:hAnsi="Times New Roman"/>
+          <w:sz w:val="22"/>
+          <w:szCs w:val="22"/>
+        </w:rPr>
+        <w:t xml:space="preserve">исчерпывающее перечисление всех кодов формата.</w:t>
+      </w:r>
+    </w:p>
+    <w:p>
+      <w:pPr>
+        <w:pStyle w:val="ListParagraph"/>
+        <w:numPr>
+          <w:ilvl w:val="0"/>
+          <w:numId w:val="2"/>
+        </w:numPr>
+        <w:spacing w:after="80" w:line="276"/>
+        <w:jc w:val="both"/>
+      </w:pPr>
+      <w:r>
+        <w:rPr>
+          <w:rFonts w:ascii="Times New Roman" w:cs="Times New Roman" w:eastAsia="Times New Roman" w:hAnsi="Times New Roman"/>
+          <w:b/>
+          <w:bCs/>
+          <w:sz w:val="22"/>
+          <w:szCs w:val="22"/>
+        </w:rPr>
+        <w:t xml:space="preserve">Форматы &gt; 8 бит: </w:t>
+      </w:r>
+      <w:r>
+        <w:rPr>
+          <w:rFonts w:ascii="Times New Roman" w:cs="Times New Roman" w:eastAsia="Times New Roman" w:hAnsi="Times New Roman"/>
+          <w:sz w:val="22"/>
+          <w:szCs w:val="22"/>
+        </w:rPr>
+        <w:t xml:space="preserve">курируемый набор именованных векторов (нуль, единица, два, три, половина, четыре, отрицательные и специальные значения формата) через явные кодеры — без перебора всех кодов и без многомегабайтных файлов.</w:t>
+      </w:r>
+    </w:p>
+    <w:p>
+      <w:pPr>
+        <w:pStyle w:val="ListParagraph"/>
+        <w:numPr>
+          <w:ilvl w:val="0"/>
+          <w:numId w:val="2"/>
+        </w:numPr>
+        <w:spacing w:after="80" w:line="276"/>
+        <w:jc w:val="both"/>
+      </w:pPr>
+      <w:r>
+        <w:rPr>
+          <w:rFonts w:ascii="Times New Roman" w:cs="Times New Roman" w:eastAsia="Times New Roman" w:hAnsi="Times New Roman"/>
+          <w:b/>
+          <w:bCs/>
+          <w:sz w:val="22"/>
+          <w:szCs w:val="22"/>
+        </w:rPr>
+        <w:t xml:space="preserve">Форматы без радикс-2 раскладки S:E:M: </w:t>
+      </w:r>
+      <w:r>
+        <w:rPr>
+          <w:rFonts w:ascii="Times New Roman" w:cs="Times New Roman" w:eastAsia="Times New Roman" w:hAnsi="Times New Roman"/>
+          <w:sz w:val="22"/>
+          <w:szCs w:val="22"/>
+        </w:rPr>
+        <w:t xml:space="preserve">структурный пакет с полными метаданными каталога, пометкой </w:t>
+      </w:r>
+      <w:r>
+        <w:rPr>
+          <w:rFonts w:ascii="Consolas" w:cs="Consolas" w:eastAsia="Consolas" w:hAnsi="Consolas"/>
+          <w:sz w:val="22"/>
+          <w:szCs w:val="22"/>
+        </w:rPr>
+        <w:t xml:space="preserve">bitexact: false</w:t>
+      </w:r>
+      <w:r>
+        <w:rPr>
+          <w:rFonts w:ascii="Times New Roman" w:cs="Times New Roman" w:eastAsia="Times New Roman" w:hAnsi="Times New Roman"/>
+          <w:sz w:val="22"/>
+          <w:szCs w:val="22"/>
+        </w:rPr>
+        <w:t xml:space="preserve"> и явным полем </w:t>
+      </w:r>
+      <w:r>
+        <w:rPr>
+          <w:rFonts w:ascii="Consolas" w:cs="Consolas" w:eastAsia="Consolas" w:hAnsi="Consolas"/>
+          <w:sz w:val="22"/>
+          <w:szCs w:val="22"/>
+        </w:rPr>
+        <w:t xml:space="preserve">structural_reason</w:t>
+      </w:r>
+      <w:r>
+        <w:rPr>
+          <w:rFonts w:ascii="Times New Roman" w:cs="Times New Roman" w:eastAsia="Times New Roman" w:hAnsi="Times New Roman"/>
+          <w:sz w:val="22"/>
+          <w:szCs w:val="22"/>
+        </w:rPr>
+        <w:t xml:space="preserve">. Это честные плейсхолдеры, а не утверждения о битоточности.</w:t>
+      </w:r>
+    </w:p>
+    <w:p>
+      <w:pPr>
+        <w:spacing w:after="120" w:line="360"/>
+        <w:ind w:firstLine="283"/>
+        <w:jc w:val="both"/>
+      </w:pPr>
+      <w:r>
+        <w:rPr>
+          <w:rFonts w:ascii="Times New Roman" w:cs="Times New Roman" w:eastAsia="Times New Roman" w:hAnsi="Times New Roman"/>
+          <w:sz w:val="22"/>
+          <w:szCs w:val="22"/>
+        </w:rPr>
+        <w:t xml:space="preserve">Итог: 49 битоточных пакетов и 34 структурных пакета (всего 83). Перекрёстная проверка относительно внешнего оракула ml_dtypes применяется к подмножеству Tier-1 (раздел 4.4, пункт 2); остальные битоточные пакеты на данный момент верифицируются самопроверкой кругового кодирования-декодирования, а внешняя перекрёстная проверка по мере появления эталонных реализаций расширяет Tier-1 (раздел 9).</w:t>
+      </w:r>
+    </w:p>
+    <w:p>
+      <w:pPr>
+        <w:spacing w:after="120" w:line="360"/>
+        <w:ind w:firstLine="283"/>
+        <w:jc w:val="both"/>
+      </w:pPr>
+      <w:r>
+        <w:rPr>
+          <w:rFonts w:ascii="Times New Roman" w:cs="Times New Roman" w:eastAsia="Times New Roman" w:hAnsi="Times New Roman"/>
+          <w:sz w:val="22"/>
+          <w:szCs w:val="22"/>
+        </w:rPr>
+        <w:t xml:space="preserve">Машиночитаемый индекс </w:t>
+      </w:r>
+      <w:r>
+        <w:rPr>
+          <w:rFonts w:ascii="Consolas" w:cs="Consolas" w:eastAsia="Consolas" w:hAnsi="Consolas"/>
+          <w:sz w:val="22"/>
+          <w:szCs w:val="22"/>
+        </w:rPr>
+        <w:t xml:space="preserve">INDEX_all_formats.json</w:t>
+      </w:r>
+      <w:r>
+        <w:rPr>
+          <w:rFonts w:ascii="Times New Roman" w:cs="Times New Roman" w:eastAsia="Times New Roman" w:hAnsi="Times New Roman"/>
+          <w:sz w:val="22"/>
+          <w:szCs w:val="22"/>
+        </w:rPr>
+        <w:t xml:space="preserve"> перечисляет все 83 пакета с итогами (</w:t>
+      </w:r>
+      <w:r>
+        <w:rPr>
+          <w:rFonts w:ascii="Consolas" w:cs="Consolas" w:eastAsia="Consolas" w:hAnsi="Consolas"/>
+          <w:sz w:val="22"/>
+          <w:szCs w:val="22"/>
+        </w:rPr>
+        <w:t xml:space="preserve">total_packs: 83, bitexact_packs: 49, structural_packs: 34</w:t>
+      </w:r>
+      <w:r>
+        <w:rPr>
+          <w:rFonts w:ascii="Times New Roman" w:cs="Times New Roman" w:eastAsia="Times New Roman" w:hAnsi="Times New Roman"/>
+          <w:sz w:val="22"/>
+          <w:szCs w:val="22"/>
+        </w:rPr>
+        <w:t xml:space="preserve">), якорным тождеством и ссылкой на SSOT.</w:t>
+      </w:r>
+    </w:p>
+    <w:p>
+      <w:pPr>
         <w:pStyle w:val="Heading1"/>
         <w:spacing w:after="140" w:before="280"/>
       </w:pPr>
@@ -6414,7 +6659,7 @@
           <w:sz w:val="30"/>
           <w:szCs w:val="30"/>
         </w:rPr>
-        <w:t xml:space="preserve">5. Шесть пакетов соответствия</w:t>
+        <w:t xml:space="preserve">5. Полный набор пакетов и шесть пакетов Tier-1</w:t>
       </w:r>
     </w:p>
     <w:p>
@@ -6429,7 +6674,23 @@
           <w:sz w:val="22"/>
           <w:szCs w:val="22"/>
         </w:rPr>
-        <w:t xml:space="preserve">Таблица 4 даёт сводку по всем шести пакетам.</w:t>
+        <w:t xml:space="preserve">Набор пакетов соответствия покрывает все 83 формата каталога — 49 битоточных пакетов и 34 структурных пакета (раздел 4.5, полный перечень и отпечатки SHA-256 — в README каталога </w:t>
+      </w:r>
+      <w:r>
+        <w:rPr>
+          <w:rFonts w:ascii="Consolas" w:cs="Consolas" w:eastAsia="Consolas" w:hAnsi="Consolas"/>
+          <w:sz w:val="22"/>
+          <w:szCs w:val="22"/>
+        </w:rPr>
+        <w:t xml:space="preserve">conformance/vectors</w:t>
+      </w:r>
+      <w:r>
+        <w:rPr>
+          <w:rFonts w:ascii="Times New Roman" w:cs="Times New Roman" w:eastAsia="Times New Roman" w:hAnsi="Times New Roman"/>
+          <w:sz w:val="22"/>
+          <w:szCs w:val="22"/>
+        </w:rPr>
+        <w:t xml:space="preserve"> репозитория gHashTag/t27). Далее подробно разбираются шесть пакетов уровня Tier-1, для которых выполнена дополнительная перекрёстная проверка относительно внешнего оракула. Таблица 4 даёт сводку по этим шести пакетам.</w:t>
       </w:r>
     </w:p>
     <w:tbl>
@@ -7803,7 +8064,7 @@
           <w:sz w:val="20"/>
           <w:szCs w:val="20"/>
         </w:rPr>
-        <w:t xml:space="preserve">Таблица 4. Шесть пакетов с первого взгляда (T4).</w:t>
+        <w:t xml:space="preserve">Таблица 4. Шесть пакетов Tier-1 с первого взгляда (T4).</w:t>
       </w:r>
     </w:p>
     <w:p>
@@ -12081,7 +12342,55 @@
           <w:sz w:val="22"/>
           <w:szCs w:val="22"/>
         </w:rPr>
-        <w:t xml:space="preserve">): единый источник истины (SSOT) для каталога и пакетов соответствия уровня Tier-1. Здесь располагаются все JSON-файлы каталога, файлы пакетов, проверки инвариантов и шаблоны кодогенерации.</w:t>
+        <w:t xml:space="preserve">): единый источник истины (SSOT) для каталога и полного набора пакетов соответствия на все 83 формата. Каталог </w:t>
+      </w:r>
+      <w:r>
+        <w:rPr>
+          <w:rFonts w:ascii="Consolas" w:cs="Consolas" w:eastAsia="Consolas" w:hAnsi="Consolas"/>
+          <w:sz w:val="22"/>
+          <w:szCs w:val="22"/>
+        </w:rPr>
+        <w:t xml:space="preserve">conformance/vectors</w:t>
+      </w:r>
+      <w:r>
+        <w:rPr>
+          <w:rFonts w:ascii="Times New Roman" w:cs="Times New Roman" w:eastAsia="Times New Roman" w:hAnsi="Times New Roman"/>
+          <w:sz w:val="22"/>
+          <w:szCs w:val="22"/>
+        </w:rPr>
+        <w:t xml:space="preserve"> содержит все файлы пакетов, машиночитаемый индекс </w:t>
+      </w:r>
+      <w:r>
+        <w:rPr>
+          <w:rFonts w:ascii="Consolas" w:cs="Consolas" w:eastAsia="Consolas" w:hAnsi="Consolas"/>
+          <w:sz w:val="22"/>
+          <w:szCs w:val="22"/>
+        </w:rPr>
+        <w:t xml:space="preserve">INDEX_all_formats.json</w:t>
+      </w:r>
+      <w:r>
+        <w:rPr>
+          <w:rFonts w:ascii="Times New Roman" w:cs="Times New Roman" w:eastAsia="Times New Roman" w:hAnsi="Times New Roman"/>
+          <w:sz w:val="22"/>
+          <w:szCs w:val="22"/>
+        </w:rPr>
+        <w:t xml:space="preserve">, README с полными отпечатками SHA-256 и каталоговый генератор </w:t>
+      </w:r>
+      <w:r>
+        <w:rPr>
+          <w:rFonts w:ascii="Consolas" w:cs="Consolas" w:eastAsia="Consolas" w:hAnsi="Consolas"/>
+          <w:sz w:val="22"/>
+          <w:szCs w:val="22"/>
+        </w:rPr>
+        <w:t xml:space="preserve">gen_all_formats.py</w:t>
+      </w:r>
+      <w:r>
+        <w:rPr>
+          <w:rFonts w:ascii="Times New Roman" w:cs="Times New Roman" w:eastAsia="Times New Roman" w:hAnsi="Times New Roman"/>
+          <w:sz w:val="22"/>
+          <w:szCs w:val="22"/>
+        </w:rPr>
+        <w:t xml:space="preserve">; рядом — JSON-файлы каталога, проверки инвариантов и шаблоны кодогенерации.</w:t>
       </w:r>
     </w:p>
     <w:p>
@@ -13406,7 +13715,39 @@
           <w:sz w:val="22"/>
           <w:szCs w:val="22"/>
         </w:rPr>
-        <w:t xml:space="preserve"> фиксирует все шесть значений SHA-256 пакетов, якорь версии ml_dtypes и ссылку на согласование с P3109 в едином машиночитаемом документе. Последующие потребители могут проверить целостность пакета, заново вычислив SHA-256 канонического JSON-файла и сравнив с записью в манифесте.</w:t>
+        <w:t xml:space="preserve"> фиксирует шесть значений SHA-256 пакетов Tier-1, якорь версии ml_dtypes и ссылку на согласование с P3109; отпечатки всех 83 пакетов перечислены в README каталога </w:t>
+      </w:r>
+      <w:r>
+        <w:rPr>
+          <w:rFonts w:ascii="Consolas" w:cs="Consolas" w:eastAsia="Consolas" w:hAnsi="Consolas"/>
+          <w:sz w:val="22"/>
+          <w:szCs w:val="22"/>
+        </w:rPr>
+        <w:t xml:space="preserve">conformance/vectors</w:t>
+      </w:r>
+      <w:r>
+        <w:rPr>
+          <w:rFonts w:ascii="Times New Roman" w:cs="Times New Roman" w:eastAsia="Times New Roman" w:hAnsi="Times New Roman"/>
+          <w:sz w:val="22"/>
+          <w:szCs w:val="22"/>
+        </w:rPr>
+        <w:t xml:space="preserve"> и в </w:t>
+      </w:r>
+      <w:r>
+        <w:rPr>
+          <w:rFonts w:ascii="Consolas" w:cs="Consolas" w:eastAsia="Consolas" w:hAnsi="Consolas"/>
+          <w:sz w:val="22"/>
+          <w:szCs w:val="22"/>
+        </w:rPr>
+        <w:t xml:space="preserve">INDEX_all_formats.json</w:t>
+      </w:r>
+      <w:r>
+        <w:rPr>
+          <w:rFonts w:ascii="Times New Roman" w:cs="Times New Roman" w:eastAsia="Times New Roman" w:hAnsi="Times New Roman"/>
+          <w:sz w:val="22"/>
+          <w:szCs w:val="22"/>
+        </w:rPr>
+        <w:t xml:space="preserve">. Последующие потребители могут проверить целостность пакета, заново вычислив SHA-256 канонического JSON-файла и сравнив с записью в манифесте/индексе.</w:t>
       </w:r>
     </w:p>
     <w:p>
@@ -13440,7 +13781,7 @@
           <w:sz w:val="26"/>
           <w:szCs w:val="26"/>
         </w:rPr>
-        <w:t xml:space="preserve">9.1. Трек 2: полный набор из 83 пакетов</w:t>
+        <w:t xml:space="preserve">9.1. Трек 2: внешняя валидация всех 83 пакетов</w:t>
       </w:r>
     </w:p>
     <w:p>
@@ -13455,7 +13796,7 @@
           <w:sz w:val="22"/>
           <w:szCs w:val="22"/>
         </w:rPr>
-        <w:t xml:space="preserve">Шесть пакетов в этой статье охватывают форматы, наиболее немедленно релевантные промышленному ML-оборудованию. Трек 2 (целевой срок III кв. 2026) расширит охват на все 83 формата каталога, для которых доступны эталонные реализации, включая:</w:t>
+        <w:t xml:space="preserve">Набор пакетов уже покрывает все 83 формата каталога на уровне представления (49 битоточных + 34 структурных; раздел 4.5). Шесть пакетов уровня Tier-1 дополнительно перекрёстно проверены относительно внешнего оракула. Трек 2 (целевой срок III кв. 2026) распространит такую внешнюю валидацию на остальные битоточные пакеты и преобразует структурные пакеты в битоточные по мере появления эталонных реализаций, включая:</w:t>
       </w:r>
     </w:p>
     <w:p>
@@ -13474,7 +13815,7 @@
           <w:sz w:val="22"/>
           <w:szCs w:val="22"/>
         </w:rPr>
-        <w:t xml:space="preserve">NVIDIA NVFP4 (элемент S1E2M1, 16-элементный блок, блочный масштаб FP8 E4M3) — закрывая структурный разрыв, задокументированный в разделе 7.2.</w:t>
+        <w:t xml:space="preserve">NVIDIA NVFP4 (элемент S1E2M1, 16-элементный блок, блочный масштаб FP8 E4M3) — парный пакет на уровне блока, закрывающий структурный разрыв, задокументированный в разделе 7.2.</w:t>
       </w:r>
     </w:p>
     <w:p>
@@ -13493,7 +13834,7 @@
           <w:sz w:val="22"/>
           <w:szCs w:val="22"/>
         </w:rPr>
-        <w:t xml:space="preserve">Остальные записи MLLowPrecision (варианты FP6, FP4, NF4).</w:t>
+        <w:t xml:space="preserve">Расширение оракульного покрытия ml_dtypes на записи MLLowPrecision (варианты FP6, FP4) и табличный NF4.</w:t>
       </w:r>
     </w:p>
     <w:p>
@@ -13512,7 +13853,7 @@
           <w:sz w:val="22"/>
           <w:szCs w:val="22"/>
         </w:rPr>
-        <w:t xml:space="preserve">Типы Posit/Unum III через оракул libtakum.</w:t>
+        <w:t xml:space="preserve">Перевод типов Posit/Unum III и тейперированных takum из структурных в битоточные через оракул libtakum.</w:t>
       </w:r>
     </w:p>
     <w:p>
@@ -13531,7 +13872,7 @@
           <w:sz w:val="22"/>
           <w:szCs w:val="22"/>
         </w:rPr>
-        <w:t xml:space="preserve">Варианты GoldenFloat от GF4 до GF256.</w:t>
+        <w:t xml:space="preserve">Закрепление смещений (bias) для широких вариантов GoldenFloat (GF128–GF1024), пока остающихся открытыми ИОКР-параметрами и потому записанных структурно.</w:t>
       </w:r>
     </w:p>
     <w:p>
@@ -13579,7 +13920,7 @@
           <w:sz w:val="22"/>
           <w:szCs w:val="22"/>
         </w:rPr>
-        <w:t xml:space="preserve"> стандарта P3109, начиная с округления NearestTiesToEven для сложения, умножения и FMA по всем шести текущим форматам. Это позволит командам компиляторов и оборудования проверять не только корректность кодирования/декодирования, но и согласие их арифметических операций со стандартом на битовом уровне.</w:t>
+        <w:t xml:space="preserve"> стандарта P3109, начиная с округления NearestTiesToEven для сложения, умножения и FMA по шести форматам Tier-1. Это позволит командам компиляторов и оборудования проверять не только корректность кодирования/декодирования, но и согласие их арифметических операций со стандартом на битовом уровне.</w:t>
       </w:r>
     </w:p>
     <w:p>
@@ -14127,7 +14468,7 @@
           <w:sz w:val="22"/>
           <w:szCs w:val="22"/>
         </w:rPr>
-        <w:t xml:space="preserve">Результаты этой статьи — каталог из 83 форматов, шесть пакетов соответствия, кросс-уолк к P3109 v3.2.0 и два задокументированных интерпретационных разрыва — зависят только от артефактов, процитированных в библиографии и публично доступных (репозитории с открытой лицензией, опубликованные стандарты и препринт arXiv GoldenFloat). Ни одно утверждение, таблица или теорема в этой статье не опирается на неопубликованные или находящиеся на рецензировании рукописи. Предстоящие последующие работы по смежным темам упоминаются только как направление будущей работы в разделе 9 и явно выходят за рамки настоящего изложения.</w:t>
+        <w:t xml:space="preserve">Результаты этой статьи — каталог из 83 форматов, полный набор пакетов соответствия на все 83 формата (49 битоточных + 34 структурных) с углублённо проверенным подмножеством Tier-1 из шести пакетов, кросс-уолк к P3109 v3.2.0 и два задокументированных интерпретационных разрыва — зависят только от артефактов, процитированных в библиографии и публично доступных (репозитории с открытой лицензией, опубликованные стандарты и препринт arXiv GoldenFloat). Ни одно утверждение, таблица или теорема в этой статье не опирается на неопубликованные или находящиеся на рецензировании рукописи. Предстоящие последующие работы по смежным темам упоминаются только как направление будущей работы в разделе 9 и явно выходят за рамки настоящего изложения.</w:t>
       </w:r>
     </w:p>
     <w:p>
@@ -14142,7 +14483,7 @@
           <w:sz w:val="22"/>
           <w:szCs w:val="22"/>
         </w:rPr>
-        <w:t xml:space="preserve">Ни одно из этих ограничений не меняет центрального утверждения статьи: каталог из 83 форматов с шестью пакетами соответствия, кросс-уолком к IEEE P3109 и двумя задокументированными интерпретационными разрывами теперь является пригодным, воспроизводимым вендор-нейтральным справочником. Они очерчивают то, чем артефакт является, в отличие от того, чем он не является.</w:t>
+        <w:t xml:space="preserve">Ни одно из этих ограничений не меняет центрального утверждения статьи: каталог из 83 форматов с полным набором пакетов соответствия на все 83 формата (49 битоточных + 34 структурных), углублённо проверенным подмножеством Tier-1 из шести пакетов, кросс-уолком к IEEE P3109 и двумя задокументированными интерпретационными разрывами теперь является пригодным, воспроизводимым вендор-нейтральным справочником. Они очерчивают то, чем артефакт является, в отличие от того, чем он не является.</w:t>
       </w:r>
     </w:p>
     <w:p>

</xml_diff>

<commit_message>
feat(paper2): синхронизация каталога с живым SSOT (49->72 bitexact, 34->11 structural, anchor 53/72)
Правки statya2_ru.docx по edit_spec_catalog_v2 (SSOT t27@8b4fd30):
- 49->72 bitexact / 34->11 structural (10 мест, согласование падежей)
- anchor-метрика: точный счёт 53/72 on-grid (было «43 of 49»); полная
  классификация 12 off-grid — LNS×4 + takum×4 + GFTernary (лог/тейпер),
  GF4/MXGF4/NF4 (грубые 4-бит); 7 pack'ов без anchor_check — честная оговорка
- сноска E8M0 (shared-exponent компонент Microscaling → канон каталога 83)
- НЕ тронуты: 83 формата, 13 кластеров, 6 Tier-1 pack'ов, SHA, phi^2+phi^-2=3
Каталог = 83; arXiv v1 «84» закрывается отдельным erratum-комментарием.
</commit_message>
<xml_diff>
--- a/paper2-catalog/statya2_ru.docx
+++ b/paper2-catalog/statya2_ru.docx
@@ -247,7 +247,7 @@
           <w:sz w:val="22"/>
           <w:szCs w:val="22"/>
         </w:rPr>
-        <w:t xml:space="preserve">В настоящей статье описаны: каталог из 83 численных форматов, охватывающий 13 семейств; полный набор пакетов соответствия (conformance packs), покрывающий все 83 формата каталога (49 битоточных пакетов с круговой проверкой кодирования-декодирования и 34 структурных пакета для форматов без фиксированной раскладки S:E:M по основанию 2); углублённое референсное подмножество из шести пакетов уровня Tier-1 для GF16, элемента MXFP4, BF16, FP8 E4M3, FP8 E5M2 и блочного масштаба E8M0, перекрёстно проверенных относительно внешнего оракула; а также кросс-уолк к IEEE P3109 v3.2.0, сопоставляющий каждый пакет Tier-1 с соответствующей конфигурируемой формой стандарта. Каждый пакет представляет собой самодостаточный документ JSON с отпечатком SHA-256, общей схемой строк и якорным вектором, кодирующим значение 3,0 — тождество </w:t>
+        <w:t xml:space="preserve">В настоящей статье описаны: каталог из 83 численных форматов, охватывающий 13 семейств; полный набор пакетов соответствия (conformance packs), покрывающий все 83 формата каталога (72 битоточных пакета с круговой проверкой кодирования-декодирования и 11 структурных пакетов для форматов без фиксированной раскладки S:E:M по основанию 2); углублённое референсное подмножество из шести пакетов уровня Tier-1 для GF16, элемента MXFP4, BF16, FP8 E4M3, FP8 E5M2 и блочного масштаба E8M0, перекрёстно проверенных относительно внешнего оракула; а также кросс-уолк к IEEE P3109 v3.2.0, сопоставляющий каждый пакет Tier-1 с соответствующей конфигурируемой формой стандарта. Каждый пакет представляет собой самодостаточный документ JSON с отпечатком SHA-256, общей схемой строк и якорным вектором, кодирующим значение 3,0 — тождество </w:t>
       </w:r>
       <w:r>
         <w:rPr>
@@ -416,7 +416,7 @@
           <w:sz w:val="22"/>
           <w:szCs w:val="22"/>
         </w:rPr>
-        <w:t xml:space="preserve">The proliferation of numeric formats in machine-learning hardware — FP8 (E4M3 and E5M2), BF16, MXFP4, block microscaling formats and dozens of research variants — has outpaced the availability of vendor-neutral, bit-exact reference material. This paper presents: a catalog of 83 numeric formats spanning 13 families; a complete conformance-pack set covering all 83 catalog formats (49 bit-exact packs with encode-decode round-trip checking and 34 structural packs for formats that have no fixed radix-2 S:E:M layout); a deeply validated Tier-1 reference subset of six packs for GF16, the MXFP4 element, BF16, FP8 E4M3, FP8 E5M2 and the E8M0 block scale, cross-checked against an external oracle; and a crosswalk to IEEE P3109 v3.2.0 mapping each Tier-1 pack to its configurable form of the standard. Every pack is a self-contained JSON document with a SHA-256 fingerprint, a shared row schema and an anchor vector encoding the value 3.0 — the identity phi^2 + 1/phi^2 = 3 — as a cross-pack correctness check. The Tier-1 packs are cross-checked against ml_dtypes 0.5.4 (Google/JAX); any discrepancy is documented explicitly and interpreted as a specification-permitted interpretive gap rather than hidden. The work is positioned as registry-filling: it proposes no new formats, makes no model-accuracy claim and asserts no superiority over any vendor implementation. All artefacts are publicly available at github.com/gHashTag/t27 under an open license.</w:t>
+        <w:t xml:space="preserve">The proliferation of numeric formats in machine-learning hardware — FP8 (E4M3 and E5M2), BF16, MXFP4, block microscaling formats and dozens of research variants — has outpaced the availability of vendor-neutral, bit-exact reference material. This paper presents: a catalog of 83 numeric formats spanning 13 families; a complete conformance-pack set covering all 83 catalog formats (72 bit-exact packs with encode-decode round-trip checking and 11 structural packs for formats that have no fixed radix-2 S:E:M layout); a deeply validated Tier-1 reference subset of six packs for GF16, the MXFP4 element, BF16, FP8 E4M3, FP8 E5M2 and the E8M0 block scale, cross-checked against an external oracle; and a crosswalk to IEEE P3109 v3.2.0 mapping each Tier-1 pack to its configurable form of the standard. Every pack is a self-contained JSON document with a SHA-256 fingerprint, a shared row schema and an anchor vector encoding the value 3.0 — the identity phi^2 + 1/phi^2 = 3 — as a cross-pack correctness check. The Tier-1 packs are cross-checked against ml_dtypes 0.5.4 (Google/JAX); any discrepancy is documented explicitly and interpreted as a specification-permitted interpretive gap rather than hidden. The work is positioned as registry-filling: it proposes no new formats, makes no model-accuracy claim and asserts no superiority over any vendor implementation. All artefacts are publicly available at github.com/gHashTag/t27 under an open license.</w:t>
       </w:r>
     </w:p>
     <w:p>
@@ -592,7 +592,7 @@
           <w:sz w:val="22"/>
           <w:szCs w:val="22"/>
         </w:rPr>
-        <w:t xml:space="preserve">Набор пакетов (раздел 5) покрывает все 83 формата каталога — по одному пакету на формат, без пропусков. Из них 49 пакетов битоточны (нативные биты декодируются в f64 точно, с проверкой кругового кодирования-декодирования), а 34 — структурны (форматы без единой фиксированной раскладки S:E:M по основанию 2 — параметрические, табличные, по основанию 16, тейперированно-логарифмические, расширенной точности или с открытыми ИОКР-параметрами), помеченные </w:t>
+        <w:t xml:space="preserve">Набор пакетов (раздел 5) покрывает все 83 формата каталога — по одному пакету на формат, без пропусков. Из них 72 пакета битоточны (нативные биты декодируются в f64 точно, с проверкой кругового кодирования-декодирования), а 11 — структурны (форматы без единой фиксированной раскладки S:E:M по основанию 2 — параметрические, табличные, по основанию 16, тейперированно-логарифмические, расширенной точности или с открытыми ИОКР-параметрами), помеченные </w:t>
       </w:r>
       <w:r>
         <w:rPr>
@@ -1136,7 +1136,7 @@
           <w:sz w:val="22"/>
           <w:szCs w:val="22"/>
         </w:rPr>
-        <w:t xml:space="preserve">Ни один отдельный вендор-нейтральный артефакт в настоящее время не охватывает FP8 E4M3, FP8 E5M2, BF16, элемент MXFP4, элемент NVFP4, GoldenFloat 16 и блочный масштаб E8M0 в единой схеме, обладая при этом: (а) битоточными векторами кодирования/декодирования; (б) происхождением, привязанным к SHA-256; (в) явной документацией каждого расхождения с эталонной реализацией; и (г) удобочитаемым кросс-уолком к IEEE P3109. Настоящая работа заполняет этот пробел реестра на уровне всего каталога: набор пакетов соответствия покрывает все 83 формата (49 битоточных + 34 структурных), а шесть наиболее немедленно развёртываемых форматов уровня представления выделены как углублённо проверенное подмножество Tier-1 (раздел 5); NVFP4 обсуждается как ближайший кандидат на включение в Tier-1 (раздел 9) и как второй интерпретационный разрыв (раздел 7).</w:t>
+        <w:t xml:space="preserve">Ни один отдельный вендор-нейтральный артефакт в настоящее время не охватывает FP8 E4M3, FP8 E5M2, BF16, элемент MXFP4, элемент NVFP4, GoldenFloat 16 и блочный масштаб E8M0 в единой схеме, обладая при этом: (а) битоточными векторами кодирования/декодирования; (б) происхождением, привязанным к SHA-256; (в) явной документацией каждого расхождения с эталонной реализацией; и (г) удобочитаемым кросс-уолком к IEEE P3109. Настоящая работа заполняет этот пробел реестра на уровне всего каталога: набор пакетов соответствия покрывает все 83 формата (72 битоточных + 11 структурных), а шесть наиболее немедленно развёртываемых форматов уровня представления выделены как углублённо проверенное подмножество Tier-1 (раздел 5); NVFP4 обсуждается как ближайший кандидат на включение в Tier-1 (раздел 9) и как второй интерпретационный разрыв (раздел 7).</w:t>
       </w:r>
     </w:p>
     <w:p>
@@ -1201,7 +1201,7 @@
           <w:sz w:val="22"/>
           <w:szCs w:val="22"/>
         </w:rPr>
-        <w:t xml:space="preserve"> содержит 83 формата, организованных в 13 именованных кластеров. Таблица 1 показывает названия кластеров и количество форматов. Сумма количеств равна ровно 83; это непрерывно контролируемый инвариант каталога (CI-01, раздел 3.4).</w:t>
+        <w:t xml:space="preserve"> содержит 83 формата, организованных в 13 именованных кластеров. Таблица 1 показывает названия кластеров и количество форматов. Сумма количеств равна ровно 83; это непрерывно контролируемый инвариант каталога (CI-01, раздел 3.4). Блочный масштаб E8M0 покрыт отдельным пакетом соответствия (раздел 5.6), однако перечисляется как компонент общего порядка (shared-exponent) семейства Microscaling, а не как самостоятельная строка каталога; каноническое число форматов, задаваемое SSOT formats_catalog.t27, равно 83.</w:t>
       </w:r>
     </w:p>
     <w:tbl>
@@ -6245,7 +6245,7 @@
           <w:sz w:val="22"/>
           <w:szCs w:val="22"/>
         </w:rPr>
-        <w:t xml:space="preserve">где φ = (1 + √5)/2 — золотое сечение. Это тождество представлено и контекстуализировано в препринте GoldenFloat как численно обоснованный L₂-якорь. Значение 3,0 точно представимо во всех шести форматах подмножества Tier-1 (оно попадает в нормальный диапазон с нулевой ошибкой мантиссы для всех шести раскладок), что делает его надёжной однострочной проверкой корректности между пакетами. В полном каталоговом наборе 3,0 точно попадает на сетку в 43 из 49 битоточных пакетов; шесть исключений (логарифмические LNS-8/16/32/64 и 4-битные GF4, MXGF4) честно фиксируют ближайшее представимое значение и истинную </w:t>
+        <w:t xml:space="preserve">где φ = (1 + √5)/2 — золотое сечение. Это тождество представлено и контекстуализировано в препринте GoldenFloat как численно обоснованный L₂-якорь. Значение 3,0 точно представимо во всех шести форматах подмножества Tier-1 (оно попадает в нормальный диапазон с нулевой ошибкой мантиссы для всех шести раскладок), что делает его надёжной однострочной проверкой корректности между пакетами. В полном каталоговом наборе поле anchor_check каждого пакета фиксирует представимость 3,0: из 72 битоточных пакетов 3,0 попадает точно на сетку (ieee754_exact: true) в 53 пакетах, а в 12 — нет. Эти 12 исключений относятся к грид-теоретическим классам, где 3,0 непредставимо точно: (i) логарифмические и тейперированно-логарифмические форматы — LNS-8/16/32/64, takum-8/16/32/64 и GFTernary (log₂3 иррационально либо не попадает на лог-сетку); (ii) наиболее грубые 4-битные сетки — GF4, MXGF4, NF4. Для этих форматов пакет честно фиксирует ближайшее представимое значение и истинную </w:t>
       </w:r>
       <w:r>
         <w:rPr>
@@ -6261,7 +6261,7 @@
           <w:sz w:val="22"/>
           <w:szCs w:val="22"/>
         </w:rPr>
-        <w:t xml:space="preserve">, поскольку log₂(3) не представим точно в LNS, а 4-битные сетки слишком грубы.</w:t>
+        <w:t xml:space="preserve"> (сумма 53 + 12 = 65). Для остальных 7 битоточных пакетов (GF14, GF48, GF96, GF128, GF512, GF1024, BCD) поле anchor_check в текущей версии набора не заполнено и представимость 3,0 в статье не заявляется.</w:t>
       </w:r>
     </w:p>
     <w:p>
@@ -6595,7 +6595,7 @@
           <w:sz w:val="22"/>
           <w:szCs w:val="22"/>
         </w:rPr>
-        <w:t xml:space="preserve">Итог: 49 битоточных пакетов и 34 структурных пакета (всего 83). Перекрёстная проверка относительно внешнего оракула ml_dtypes применяется к подмножеству Tier-1 (раздел 4.4, пункт 2); остальные битоточные пакеты на данный момент верифицируются самопроверкой кругового кодирования-декодирования, а внешняя перекрёстная проверка по мере появления эталонных реализаций расширяет Tier-1 (раздел 9).</w:t>
+        <w:t xml:space="preserve">Итог: 72 битоточных пакета и 11 структурных пакетов (всего 83). Перекрёстная проверка относительно внешнего оракула ml_dtypes применяется к подмножеству Tier-1 (раздел 4.4, пункт 2); остальные битоточные пакеты на данный момент верифицируются самопроверкой кругового кодирования-декодирования, а внешняя перекрёстная проверка по мере появления эталонных реализаций расширяет Tier-1 (раздел 9).</w:t>
       </w:r>
     </w:p>
     <w:p>
@@ -6634,7 +6634,7 @@
           <w:sz w:val="22"/>
           <w:szCs w:val="22"/>
         </w:rPr>
-        <w:t xml:space="preserve">total_packs: 83, bitexact_packs: 49, structural_packs: 34</w:t>
+        <w:t xml:space="preserve">total_packs: 83, bitexact_packs: 72, structural_packs: 11</w:t>
       </w:r>
       <w:r>
         <w:rPr>
@@ -6674,7 +6674,7 @@
           <w:sz w:val="22"/>
           <w:szCs w:val="22"/>
         </w:rPr>
-        <w:t xml:space="preserve">Набор пакетов соответствия покрывает все 83 формата каталога — 49 битоточных пакетов и 34 структурных пакета (раздел 4.5, полный перечень и отпечатки SHA-256 — в README каталога </w:t>
+        <w:t xml:space="preserve">Набор пакетов соответствия покрывает все 83 формата каталога — 72 битоточных пакета и 11 структурных пакетов (раздел 4.5, полный перечень и отпечатки SHA-256 — в README каталога </w:t>
       </w:r>
       <w:r>
         <w:rPr>
@@ -13796,7 +13796,7 @@
           <w:sz w:val="22"/>
           <w:szCs w:val="22"/>
         </w:rPr>
-        <w:t xml:space="preserve">Набор пакетов уже покрывает все 83 формата каталога на уровне представления (49 битоточных + 34 структурных; раздел 4.5). Шесть пакетов уровня Tier-1 дополнительно перекрёстно проверены относительно внешнего оракула. Трек 2 (целевой срок III кв. 2026) распространит такую внешнюю валидацию на остальные битоточные пакеты и преобразует структурные пакеты в битоточные по мере появления эталонных реализаций, включая:</w:t>
+        <w:t xml:space="preserve">Набор пакетов уже покрывает все 83 формата каталога на уровне представления (72 битоточных + 11 структурных; раздел 4.5). Шесть пакетов уровня Tier-1 дополнительно перекрёстно проверены относительно внешнего оракула. Трек 2 (целевой срок III кв. 2026) распространит такую внешнюю валидацию на остальные битоточные пакеты и преобразует структурные пакеты в битоточные по мере появления эталонных реализаций, включая:</w:t>
       </w:r>
     </w:p>
     <w:p>
@@ -14468,7 +14468,7 @@
           <w:sz w:val="22"/>
           <w:szCs w:val="22"/>
         </w:rPr>
-        <w:t xml:space="preserve">Результаты этой статьи — каталог из 83 форматов, полный набор пакетов соответствия на все 83 формата (49 битоточных + 34 структурных) с углублённо проверенным подмножеством Tier-1 из шести пакетов, кросс-уолк к P3109 v3.2.0 и два задокументированных интерпретационных разрыва — зависят только от артефактов, процитированных в библиографии и публично доступных (репозитории с открытой лицензией, опубликованные стандарты и препринт arXiv GoldenFloat). Ни одно утверждение, таблица или теорема в этой статье не опирается на неопубликованные или находящиеся на рецензировании рукописи. Предстоящие последующие работы по смежным темам упоминаются только как направление будущей работы в разделе 9 и явно выходят за рамки настоящего изложения.</w:t>
+        <w:t xml:space="preserve">Результаты этой статьи — каталог из 83 форматов, полный набор пакетов соответствия на все 83 формата (72 битоточных + 11 структурных) с углублённо проверенным подмножеством Tier-1 из шести пакетов, кросс-уолк к P3109 v3.2.0 и два задокументированных интерпретационных разрыва — зависят только от артефактов, процитированных в библиографии и публично доступных (репозитории с открытой лицензией, опубликованные стандарты и препринт arXiv GoldenFloat). Ни одно утверждение, таблица или теорема в этой статье не опирается на неопубликованные или находящиеся на рецензировании рукописи. Предстоящие последующие работы по смежным темам упоминаются только как направление будущей работы в разделе 9 и явно выходят за рамки настоящего изложения.</w:t>
       </w:r>
     </w:p>
     <w:p>
@@ -14483,7 +14483,7 @@
           <w:sz w:val="22"/>
           <w:szCs w:val="22"/>
         </w:rPr>
-        <w:t xml:space="preserve">Ни одно из этих ограничений не меняет центрального утверждения статьи: каталог из 83 форматов с полным набором пакетов соответствия на все 83 формата (49 битоточных + 34 структурных), углублённо проверенным подмножеством Tier-1 из шести пакетов, кросс-уолком к IEEE P3109 и двумя задокументированными интерпретационными разрывами теперь является пригодным, воспроизводимым вендор-нейтральным справочником. Они очерчивают то, чем артефакт является, в отличие от того, чем он не является.</w:t>
+        <w:t xml:space="preserve">Ни одно из этих ограничений не меняет центрального утверждения статьи: каталог из 83 форматов с полным набором пакетов соответствия на все 83 формата (72 битоточных + 11 структурных), углублённо проверенным подмножеством Tier-1 из шести пакетов, кросс-уолком к IEEE P3109 и двумя задокументированными интерпретационными разрывами теперь является пригодным, воспроизводимым вендор-нейтральным справочником. Они очерчивают то, чем артефакт является, в отличие от того, чем он не является.</w:t>
       </w:r>
     </w:p>
     <w:p>

</xml_diff>

<commit_message>
feat(paper2): каталог 72->69/6/8 (bit-precise 69 + selfconsistent 6 + structural 8)
- Пересчёт по живому SSOT (t27 master INDEX после #1345): 69 битоточных пакетов
  (independent 2-й witness, abs_error=0), 6 самосогласованных (единый decode-закон,
  поднимаемы) и 8 структурных (без фиксированной S:E:M раскладки, terminal).
- anchor: 55 on-grid (ieee754_exact) + 12 off-grid + 2 no-field = 69.
- Достижимый программный потолок ~75/83 (69 + 6 promotable); 8 structural честно
  остаются без single decode law.
- Синхронизирован генератор build.js (был рассинхронизирован на 49/34) со статьёй.
</commit_message>
<xml_diff>
--- a/paper2-catalog/statya2_ru.docx
+++ b/paper2-catalog/statya2_ru.docx
@@ -176,7 +176,7 @@
         </w:rPr>
         <w:t xml:space="preserve">ORCID: </w:t>
       </w:r>
-      <w:hyperlink w:history="1" r:id="rIdnprhnecwfrgtug7o60czb">
+      <w:hyperlink w:history="1" r:id="rId0k-aiys56r-21htzbiaft">
         <w:r>
           <w:rPr>
             <w:rStyle w:val="Hyperlink"/>
@@ -247,7 +247,7 @@
           <w:sz w:val="22"/>
           <w:szCs w:val="22"/>
         </w:rPr>
-        <w:t xml:space="preserve">В настоящей статье описаны: каталог из 83 численных форматов, охватывающий 13 семейств; полный набор пакетов соответствия (conformance packs), покрывающий все 83 формата каталога (72 битоточных пакета с круговой проверкой кодирования-декодирования и 11 структурных пакетов для форматов без фиксированной раскладки S:E:M по основанию 2); углублённое референсное подмножество из шести пакетов уровня Tier-1 для GF16, элемента MXFP4, BF16, FP8 E4M3, FP8 E5M2 и блочного масштаба E8M0, перекрёстно проверенных относительно внешнего оракула; а также кросс-уолк к IEEE P3109 v3.2.0, сопоставляющий каждый пакет Tier-1 с соответствующей конфигурируемой формой стандарта. Каждый пакет представляет собой самодостаточный документ JSON с отпечатком SHA-256, общей схемой строк и якорным вектором, кодирующим значение 3,0 — тождество </w:t>
+        <w:t xml:space="preserve">В настоящей статье описаны: каталог из 83 численных форматов, охватывающий 13 семейств; полный набор пакетов соответствия (conformance packs), покрывающий все 83 формата каталога (69 битоточных пакетов с круговой проверкой кодирования-декодирования, 6 самосогласованных пакетов (единый закон декодирования без независимого второго witness) и 8 структурных пакетов для форматов без фиксированной раскладки S:E:M по основанию 2); углублённое референсное подмножество из шести пакетов уровня Tier-1 для GF16, элемента MXFP4, BF16, FP8 E4M3, FP8 E5M2 и блочного масштаба E8M0, перекрёстно проверенных относительно внешнего оракула; а также кросс-уолк к IEEE P3109 v3.2.0, сопоставляющий каждый пакет Tier-1 с соответствующей конфигурируемой формой стандарта. Каждый пакет представляет собой самодостаточный документ JSON с отпечатком SHA-256, общей схемой строк и якорным вектором, кодирующим значение 3,0 — тождество </w:t>
       </w:r>
       <w:r>
         <w:rPr>
@@ -416,7 +416,7 @@
           <w:sz w:val="22"/>
           <w:szCs w:val="22"/>
         </w:rPr>
-        <w:t xml:space="preserve">The proliferation of numeric formats in machine-learning hardware — FP8 (E4M3 and E5M2), BF16, MXFP4, block microscaling formats and dozens of research variants — has outpaced the availability of vendor-neutral, bit-exact reference material. This paper presents: a catalog of 83 numeric formats spanning 13 families; a complete conformance-pack set covering all 83 catalog formats (72 bit-exact packs with encode-decode round-trip checking and 11 structural packs for formats that have no fixed radix-2 S:E:M layout); a deeply validated Tier-1 reference subset of six packs for GF16, the MXFP4 element, BF16, FP8 E4M3, FP8 E5M2 and the E8M0 block scale, cross-checked against an external oracle; and a crosswalk to IEEE P3109 v3.2.0 mapping each Tier-1 pack to its configurable form of the standard. Every pack is a self-contained JSON document with a SHA-256 fingerprint, a shared row schema and an anchor vector encoding the value 3.0 — the identity phi^2 + 1/phi^2 = 3 — as a cross-pack correctness check. The Tier-1 packs are cross-checked against ml_dtypes 0.5.4 (Google/JAX); any discrepancy is documented explicitly and interpreted as a specification-permitted interpretive gap rather than hidden. The work is positioned as registry-filling: it proposes no new formats, makes no model-accuracy claim and asserts no superiority over any vendor implementation. All artefacts are publicly available at github.com/gHashTag/t27 under an open license.</w:t>
+        <w:t xml:space="preserve">The proliferation of numeric formats in machine-learning hardware — FP8 (E4M3 and E5M2), BF16, MXFP4, block microscaling formats and dozens of research variants — has outpaced the availability of vendor-neutral, bit-exact reference material. This paper presents: a catalog of 83 numeric formats spanning 13 families; a complete conformance-pack set covering all 83 catalog formats (69 bit-exact packs with encode-decode round-trip checking, 6 self-consistent packs (single decode law without an independent second witness), and 8 structural packs for formats that have no fixed radix-2 S:E:M layout); a deeply validated Tier-1 reference subset of six packs for GF16, the MXFP4 element, BF16, FP8 E4M3, FP8 E5M2 and the E8M0 block scale, cross-checked against an external oracle; and a crosswalk to IEEE P3109 v3.2.0 mapping each Tier-1 pack to its configurable form of the standard. Every pack is a self-contained JSON document with a SHA-256 fingerprint, a shared row schema and an anchor vector encoding the value 3.0 — the identity phi^2 + 1/phi^2 = 3 — as a cross-pack correctness check. The Tier-1 packs are cross-checked against ml_dtypes 0.5.4 (Google/JAX); any discrepancy is documented explicitly and interpreted as a specification-permitted interpretive gap rather than hidden. The work is positioned as registry-filling: it proposes no new formats, makes no model-accuracy claim and asserts no superiority over any vendor implementation. All artefacts are publicly available at github.com/gHashTag/t27 under an open license.</w:t>
       </w:r>
     </w:p>
     <w:p>
@@ -592,7 +592,7 @@
           <w:sz w:val="22"/>
           <w:szCs w:val="22"/>
         </w:rPr>
-        <w:t xml:space="preserve">Набор пакетов (раздел 5) покрывает все 83 формата каталога — по одному пакету на формат, без пропусков. Из них 72 пакета битоточны (нативные биты декодируются в f64 точно, с проверкой кругового кодирования-декодирования), а 11 — структурны (форматы без единой фиксированной раскладки S:E:M по основанию 2 — параметрические, табличные, по основанию 16, тейперированно-логарифмические, расширенной точности или с открытыми ИОКР-параметрами), помеченные </w:t>
+        <w:t xml:space="preserve">Набор пакетов (раздел 5) покрывает все 83 формата каталога — по одному пакету на формат, без пропусков. Из них 69 пакетов битоточны (нативные биты декодируются в f64 точно, с проверкой кругового кодирования-декодирования), 6 самосогласованны (единый закон декодирования, но пока без независимого второго witness — поднимаемы до битоточных), а 8 — структурны (форматы без единой фиксированной раскладки S:E:M по основанию 2 — параметрические, табличные, по основанию 16, тейперированно-логарифмические, расширенной точности или с открытыми ИОКР-параметрами), помеченные </w:t>
       </w:r>
       <w:r>
         <w:rPr>
@@ -1136,7 +1136,7 @@
           <w:sz w:val="22"/>
           <w:szCs w:val="22"/>
         </w:rPr>
-        <w:t xml:space="preserve">Ни один отдельный вендор-нейтральный артефакт в настоящее время не охватывает FP8 E4M3, FP8 E5M2, BF16, элемент MXFP4, элемент NVFP4, GoldenFloat 16 и блочный масштаб E8M0 в единой схеме, обладая при этом: (а) битоточными векторами кодирования/декодирования; (б) происхождением, привязанным к SHA-256; (в) явной документацией каждого расхождения с эталонной реализацией; и (г) удобочитаемым кросс-уолком к IEEE P3109. Настоящая работа заполняет этот пробел реестра на уровне всего каталога: набор пакетов соответствия покрывает все 83 формата (72 битоточных + 11 структурных), а шесть наиболее немедленно развёртываемых форматов уровня представления выделены как углублённо проверенное подмножество Tier-1 (раздел 5); NVFP4 обсуждается как ближайший кандидат на включение в Tier-1 (раздел 9) и как второй интерпретационный разрыв (раздел 7).</w:t>
+        <w:t xml:space="preserve">Ни один отдельный вендор-нейтральный артефакт в настоящее время не охватывает FP8 E4M3, FP8 E5M2, BF16, элемент MXFP4, элемент NVFP4, GoldenFloat 16 и блочный масштаб E8M0 в единой схеме, обладая при этом: (а) битоточными векторами кодирования/декодирования; (б) происхождением, привязанным к SHA-256; (в) явной документацией каждого расхождения с эталонной реализацией; и (г) удобочитаемым кросс-уолком к IEEE P3109. Настоящая работа заполняет этот пробел реестра на уровне всего каталога: набор пакетов соответствия покрывает все 83 формата (69 битоточных + 6 самосогласованных + 8 структурных), а шесть наиболее немедленно развёртываемых форматов уровня представления выделены как углублённо проверенное подмножество Tier-1 (раздел 5); NVFP4 обсуждается как ближайший кандидат на включение в Tier-1 (раздел 9) и как второй интерпретационный разрыв (раздел 7).</w:t>
       </w:r>
     </w:p>
     <w:p>
@@ -1201,7 +1201,7 @@
           <w:sz w:val="22"/>
           <w:szCs w:val="22"/>
         </w:rPr>
-        <w:t xml:space="preserve"> содержит 83 формата, организованных в 13 именованных кластеров. Таблица 1 показывает названия кластеров и количество форматов. Сумма количеств равна ровно 83; это непрерывно контролируемый инвариант каталога (CI-01, раздел 3.4). Блочный масштаб E8M0 покрыт отдельным пакетом соответствия (раздел 5.6), однако перечисляется как компонент общего порядка (shared-exponent) семейства Microscaling, а не как самостоятельная строка каталога; каноническое число форматов, задаваемое SSOT formats_catalog.t27, равно 83.</w:t>
+        <w:t xml:space="preserve"> содержит 83 формата, организованных в 13 именованных кластеров. Таблица 1 показывает названия кластеров и количество форматов. Сумма количеств равна ровно 83; это непрерывно контролируемый инвариант каталога (CI-01, раздел 3.4).</w:t>
       </w:r>
     </w:p>
     <w:tbl>
@@ -6245,7 +6245,7 @@
           <w:sz w:val="22"/>
           <w:szCs w:val="22"/>
         </w:rPr>
-        <w:t xml:space="preserve">где φ = (1 + √5)/2 — золотое сечение. Это тождество представлено и контекстуализировано в препринте GoldenFloat как численно обоснованный L₂-якорь. Значение 3,0 точно представимо во всех шести форматах подмножества Tier-1 (оно попадает в нормальный диапазон с нулевой ошибкой мантиссы для всех шести раскладок), что делает его надёжной однострочной проверкой корректности между пакетами. В полном каталоговом наборе поле anchor_check каждого пакета фиксирует представимость 3,0: из 72 битоточных пакетов 3,0 попадает точно на сетку (ieee754_exact: true) в 53 пакетах, а в 12 — нет. Эти 12 исключений относятся к грид-теоретическим классам, где 3,0 непредставимо точно: (i) логарифмические и тейперированно-логарифмические форматы — LNS-8/16/32/64, takum-8/16/32/64 и GFTernary (log₂3 иррационально либо не попадает на лог-сетку); (ii) наиболее грубые 4-битные сетки — GF4, MXGF4, NF4. Для этих форматов пакет честно фиксирует ближайшее представимое значение и истинную </w:t>
+        <w:t xml:space="preserve">где φ = (1 + √5)/2 — золотое сечение. Это тождество представлено и контекстуализировано в препринте GoldenFloat как численно обоснованный L₂-якорь. Значение 3,0 точно представимо во всех шести форматах подмножества Tier-1 (оно попадает в нормальный диапазон с нулевой ошибкой мантиссы для всех шести раскладок), что делает его надёжной однострочной проверкой корректности между пакетами. В полном каталоговом наборе поле anchor_check каждого пакета фиксирует представимость 3,0: из 69 битоточных пакетов 3,0 попадает точно на сетку (ieee754_exact: true) в 55 пакетах, а в 12 — нет. Эти 12 исключений относятся к грид-теоретическим классам, где 3,0 непредставимо точно: логарифмические и тейперированно-логарифмические форматы (LNS-8/16/32/64, takum-8/16/32/64, GFTernary; log₂3 иррационально либо не попадает на лог-сетку) и наиболее грубые 4-битные сетки (GF4, MXGF4, NF4). Для этих форматов пакет честно фиксирует ближайшее представимое значение и истинную </w:t>
       </w:r>
       <w:r>
         <w:rPr>
@@ -6261,7 +6261,7 @@
           <w:sz w:val="22"/>
           <w:szCs w:val="22"/>
         </w:rPr>
-        <w:t xml:space="preserve"> (сумма 53 + 12 = 65). Для остальных 7 битоточных пакетов (GF14, GF48, GF96, GF128, GF512, GF1024, BCD) поле anchor_check в текущей версии набора не заполнено и представимость 3,0 в статье не заявляется.</w:t>
+        <w:t xml:space="preserve">. Для остальных 2 битоточных пакетов (GF14, BCD) поле anchor_check не заполнено. Шесть широких GF-форматов (GF48, GF96, GF128, GF256, GF512, GF1024) отнесены к самосогласованным: у них зафиксирован единый закон декодирования, но пока нет независимой второй эталонной реализации, что даёт достижимый программный потолок порядка 75 из 83 форматов.</w:t>
       </w:r>
     </w:p>
     <w:p>
@@ -6595,7 +6595,7 @@
           <w:sz w:val="22"/>
           <w:szCs w:val="22"/>
         </w:rPr>
-        <w:t xml:space="preserve">Итог: 72 битоточных пакета и 11 структурных пакетов (всего 83). Перекрёстная проверка относительно внешнего оракула ml_dtypes применяется к подмножеству Tier-1 (раздел 4.4, пункт 2); остальные битоточные пакеты на данный момент верифицируются самопроверкой кругового кодирования-декодирования, а внешняя перекрёстная проверка по мере появления эталонных реализаций расширяет Tier-1 (раздел 9).</w:t>
+        <w:t xml:space="preserve">Итог: 69 битоточных пакетов, 6 самосогласованных и 8 структурных пакетов (всего 83). Перекрёстная проверка относительно внешнего оракула ml_dtypes применяется к подмножеству Tier-1 (раздел 4.4, пункт 2); остальные битоточные пакеты на данный момент верифицируются самопроверкой кругового кодирования-декодирования, а внешняя перекрёстная проверка по мере появления эталонных реализаций расширяет Tier-1 (раздел 9).</w:t>
       </w:r>
     </w:p>
     <w:p>
@@ -6634,7 +6634,7 @@
           <w:sz w:val="22"/>
           <w:szCs w:val="22"/>
         </w:rPr>
-        <w:t xml:space="preserve">total_packs: 83, bitexact_packs: 72, structural_packs: 11</w:t>
+        <w:t xml:space="preserve">total_packs: 83, bitexact_packs: 69, selfconsistent_packs: 6, structural_packs: 8</w:t>
       </w:r>
       <w:r>
         <w:rPr>
@@ -6674,7 +6674,7 @@
           <w:sz w:val="22"/>
           <w:szCs w:val="22"/>
         </w:rPr>
-        <w:t xml:space="preserve">Набор пакетов соответствия покрывает все 83 формата каталога — 72 битоточных пакета и 11 структурных пакетов (раздел 4.5, полный перечень и отпечатки SHA-256 — в README каталога </w:t>
+        <w:t xml:space="preserve">Набор пакетов соответствия покрывает все 83 формата каталога — 69 битоточных пакетов, 6 самосогласованных и 8 структурных пакетов (раздел 4.5, полный перечень и отпечатки SHA-256 — в README каталога </w:t>
       </w:r>
       <w:r>
         <w:rPr>
@@ -13796,7 +13796,7 @@
           <w:sz w:val="22"/>
           <w:szCs w:val="22"/>
         </w:rPr>
-        <w:t xml:space="preserve">Набор пакетов уже покрывает все 83 формата каталога на уровне представления (72 битоточных + 11 структурных; раздел 4.5). Шесть пакетов уровня Tier-1 дополнительно перекрёстно проверены относительно внешнего оракула. Трек 2 (целевой срок III кв. 2026) распространит такую внешнюю валидацию на остальные битоточные пакеты и преобразует структурные пакеты в битоточные по мере появления эталонных реализаций, включая:</w:t>
+        <w:t xml:space="preserve">Набор пакетов уже покрывает все 83 формата каталога на уровне представления (69 битоточных + 6 самосогласованных + 8 структурных; раздел 4.5). Шесть пакетов уровня Tier-1 дополнительно перекрёстно проверены относительно внешнего оракула. Трек 2 (целевой срок III кв. 2026) распространит такую внешнюю валидацию на остальные битоточные пакеты и преобразует структурные пакеты в битоточные по мере появления эталонных реализаций, включая:</w:t>
       </w:r>
     </w:p>
     <w:p>
@@ -14468,7 +14468,7 @@
           <w:sz w:val="22"/>
           <w:szCs w:val="22"/>
         </w:rPr>
-        <w:t xml:space="preserve">Результаты этой статьи — каталог из 83 форматов, полный набор пакетов соответствия на все 83 формата (72 битоточных + 11 структурных) с углублённо проверенным подмножеством Tier-1 из шести пакетов, кросс-уолк к P3109 v3.2.0 и два задокументированных интерпретационных разрыва — зависят только от артефактов, процитированных в библиографии и публично доступных (репозитории с открытой лицензией, опубликованные стандарты и препринт arXiv GoldenFloat). Ни одно утверждение, таблица или теорема в этой статье не опирается на неопубликованные или находящиеся на рецензировании рукописи. Предстоящие последующие работы по смежным темам упоминаются только как направление будущей работы в разделе 9 и явно выходят за рамки настоящего изложения.</w:t>
+        <w:t xml:space="preserve">Результаты этой статьи — каталог из 83 форматов, полный набор пакетов соответствия на все 83 формата (69 битоточных + 6 самосогласованных + 8 структурных) с углублённо проверенным подмножеством Tier-1 из шести пакетов, кросс-уолк к P3109 v3.2.0 и два задокументированных интерпретационных разрыва — зависят только от артефактов, процитированных в библиографии и публично доступных (репозитории с открытой лицензией, опубликованные стандарты и препринт arXiv GoldenFloat). Ни одно утверждение, таблица или теорема в этой статье не опирается на неопубликованные или находящиеся на рецензировании рукописи. Предстоящие последующие работы по смежным темам упоминаются только как направление будущей работы в разделе 9 и явно выходят за рамки настоящего изложения.</w:t>
       </w:r>
     </w:p>
     <w:p>
@@ -14483,7 +14483,7 @@
           <w:sz w:val="22"/>
           <w:szCs w:val="22"/>
         </w:rPr>
-        <w:t xml:space="preserve">Ни одно из этих ограничений не меняет центрального утверждения статьи: каталог из 83 форматов с полным набором пакетов соответствия на все 83 формата (72 битоточных + 11 структурных), углублённо проверенным подмножеством Tier-1 из шести пакетов, кросс-уолком к IEEE P3109 и двумя задокументированными интерпретационными разрывами теперь является пригодным, воспроизводимым вендор-нейтральным справочником. Они очерчивают то, чем артефакт является, в отличие от того, чем он не является.</w:t>
+        <w:t xml:space="preserve">Ни одно из этих ограничений не меняет центрального утверждения статьи: каталог из 83 форматов с полным набором пакетов соответствия на все 83 формата (69 битоточных + 6 самосогласованных + 8 структурных), углублённо проверенным подмножеством Tier-1 из шести пакетов, кросс-уолком к IEEE P3109 и двумя задокументированными интерпретационными разрывами теперь является пригодным, воспроизводимым вендор-нейтральным справочником. Они очерчивают то, чем артефакт является, в отличие от того, чем он не является.</w:t>
       </w:r>
     </w:p>
     <w:p>

</xml_diff>

<commit_message>
paper2: sync conformance-pack counter to SSOT 75/0/8 (promote 6 wide GF selfconsistent->bitexact)
</commit_message>
<xml_diff>
--- a/paper2-catalog/statya2_ru.docx
+++ b/paper2-catalog/statya2_ru.docx
@@ -176,7 +176,7 @@
         </w:rPr>
         <w:t xml:space="preserve">ORCID: </w:t>
       </w:r>
-      <w:hyperlink w:history="1" r:id="rId0k-aiys56r-21htzbiaft">
+      <w:hyperlink w:history="1" r:id="rId3o6yf-wlkxkp-eocixvoa">
         <w:r>
           <w:rPr>
             <w:rStyle w:val="Hyperlink"/>
@@ -247,7 +247,7 @@
           <w:sz w:val="22"/>
           <w:szCs w:val="22"/>
         </w:rPr>
-        <w:t xml:space="preserve">В настоящей статье описаны: каталог из 83 численных форматов, охватывающий 13 семейств; полный набор пакетов соответствия (conformance packs), покрывающий все 83 формата каталога (69 битоточных пакетов с круговой проверкой кодирования-декодирования, 6 самосогласованных пакетов (единый закон декодирования без независимого второго witness) и 8 структурных пакетов для форматов без фиксированной раскладки S:E:M по основанию 2); углублённое референсное подмножество из шести пакетов уровня Tier-1 для GF16, элемента MXFP4, BF16, FP8 E4M3, FP8 E5M2 и блочного масштаба E8M0, перекрёстно проверенных относительно внешнего оракула; а также кросс-уолк к IEEE P3109 v3.2.0, сопоставляющий каждый пакет Tier-1 с соответствующей конфигурируемой формой стандарта. Каждый пакет представляет собой самодостаточный документ JSON с отпечатком SHA-256, общей схемой строк и якорным вектором, кодирующим значение 3,0 — тождество </w:t>
+        <w:t xml:space="preserve">В настоящей статье описаны: каталог из 83 численных форматов, охватывающий 13 семейств; полный набор пакетов соответствия (conformance packs), покрывающий все 83 формата каталога (75 битоточных пакетов с круговой проверкой кодирования-декодирования, 0 самосогласованных пакетов (единый закон декодирования без независимого второго witness) и 8 структурных пакетов для форматов без фиксированной раскладки S:E:M по основанию 2); углублённое референсное подмножество из шести пакетов уровня Tier-1 для GF16, элемента MXFP4, BF16, FP8 E4M3, FP8 E5M2 и блочного масштаба E8M0, перекрёстно проверенных относительно внешнего оракула; а также кросс-уолк к IEEE P3109 v3.2.0, сопоставляющий каждый пакет Tier-1 с соответствующей конфигурируемой формой стандарта. Каждый пакет представляет собой самодостаточный документ JSON с отпечатком SHA-256, общей схемой строк и якорным вектором, кодирующим значение 3,0 — тождество </w:t>
       </w:r>
       <w:r>
         <w:rPr>
@@ -416,7 +416,7 @@
           <w:sz w:val="22"/>
           <w:szCs w:val="22"/>
         </w:rPr>
-        <w:t xml:space="preserve">The proliferation of numeric formats in machine-learning hardware — FP8 (E4M3 and E5M2), BF16, MXFP4, block microscaling formats and dozens of research variants — has outpaced the availability of vendor-neutral, bit-exact reference material. This paper presents: a catalog of 83 numeric formats spanning 13 families; a complete conformance-pack set covering all 83 catalog formats (69 bit-exact packs with encode-decode round-trip checking, 6 self-consistent packs (single decode law without an independent second witness), and 8 structural packs for formats that have no fixed radix-2 S:E:M layout); a deeply validated Tier-1 reference subset of six packs for GF16, the MXFP4 element, BF16, FP8 E4M3, FP8 E5M2 and the E8M0 block scale, cross-checked against an external oracle; and a crosswalk to IEEE P3109 v3.2.0 mapping each Tier-1 pack to its configurable form of the standard. Every pack is a self-contained JSON document with a SHA-256 fingerprint, a shared row schema and an anchor vector encoding the value 3.0 — the identity phi^2 + 1/phi^2 = 3 — as a cross-pack correctness check. The Tier-1 packs are cross-checked against ml_dtypes 0.5.4 (Google/JAX); any discrepancy is documented explicitly and interpreted as a specification-permitted interpretive gap rather than hidden. The work is positioned as registry-filling: it proposes no new formats, makes no model-accuracy claim and asserts no superiority over any vendor implementation. All artefacts are publicly available at github.com/gHashTag/t27 under an open license.</w:t>
+        <w:t xml:space="preserve">The proliferation of numeric formats in machine-learning hardware — FP8 (E4M3 and E5M2), BF16, MXFP4, block microscaling formats and dozens of research variants — has outpaced the availability of vendor-neutral, bit-exact reference material. This paper presents: a catalog of 83 numeric formats spanning 13 families; a complete conformance-pack set covering all 83 catalog formats (75 bit-exact packs with encode-decode round-trip checking, 0 self-consistent packs (single decode law without an independent second witness), and 8 structural packs for formats that have no fixed radix-2 S:E:M layout); a deeply validated Tier-1 reference subset of six packs for GF16, the MXFP4 element, BF16, FP8 E4M3, FP8 E5M2 and the E8M0 block scale, cross-checked against an external oracle; and a crosswalk to IEEE P3109 v3.2.0 mapping each Tier-1 pack to its configurable form of the standard. Every pack is a self-contained JSON document with a SHA-256 fingerprint, a shared row schema and an anchor vector encoding the value 3.0 — the identity phi^2 + 1/phi^2 = 3 — as a cross-pack correctness check. The Tier-1 packs are cross-checked against ml_dtypes 0.5.4 (Google/JAX); any discrepancy is documented explicitly and interpreted as a specification-permitted interpretive gap rather than hidden. The work is positioned as registry-filling: it proposes no new formats, makes no model-accuracy claim and asserts no superiority over any vendor implementation. All artefacts are publicly available at github.com/gHashTag/t27 under an open license.</w:t>
       </w:r>
     </w:p>
     <w:p>
@@ -592,7 +592,7 @@
           <w:sz w:val="22"/>
           <w:szCs w:val="22"/>
         </w:rPr>
-        <w:t xml:space="preserve">Набор пакетов (раздел 5) покрывает все 83 формата каталога — по одному пакету на формат, без пропусков. Из них 69 пакетов битоточны (нативные биты декодируются в f64 точно, с проверкой кругового кодирования-декодирования), 6 самосогласованны (единый закон декодирования, но пока без независимого второго witness — поднимаемы до битоточных), а 8 — структурны (форматы без единой фиксированной раскладки S:E:M по основанию 2 — параметрические, табличные, по основанию 16, тейперированно-логарифмические, расширенной точности или с открытыми ИОКР-параметрами), помеченные </w:t>
+        <w:t xml:space="preserve">Набор пакетов (раздел 5) покрывает все 83 формата каталога — по одному пакету на формат, без пропусков. Из них 75 пакетов битоточны (нативные биты декодируются в f64 точно, с проверкой кругового кодирования-декодирования); в их число входят шесть широких GF-форматов (GF48, GF96, GF128, GF256, GF512, GF1024), ранее классифицированных как самосогласованные, а теперь поднятых до строгой битоточности независимым вторым декодером (dyadic-exact, abs_error=0). Самосогласованных пакетов не осталось (0). Оставшиеся 8 — структурны (форматы без единой фиксированной раскладки S:E:M по основанию 2 — параметрические, табличные, по основанию 16, тейперированно-логарифмические, расширенной точности или с открытыми ИОКР-параметрами), помеченные </w:t>
       </w:r>
       <w:r>
         <w:rPr>
@@ -1136,7 +1136,7 @@
           <w:sz w:val="22"/>
           <w:szCs w:val="22"/>
         </w:rPr>
-        <w:t xml:space="preserve">Ни один отдельный вендор-нейтральный артефакт в настоящее время не охватывает FP8 E4M3, FP8 E5M2, BF16, элемент MXFP4, элемент NVFP4, GoldenFloat 16 и блочный масштаб E8M0 в единой схеме, обладая при этом: (а) битоточными векторами кодирования/декодирования; (б) происхождением, привязанным к SHA-256; (в) явной документацией каждого расхождения с эталонной реализацией; и (г) удобочитаемым кросс-уолком к IEEE P3109. Настоящая работа заполняет этот пробел реестра на уровне всего каталога: набор пакетов соответствия покрывает все 83 формата (69 битоточных + 6 самосогласованных + 8 структурных), а шесть наиболее немедленно развёртываемых форматов уровня представления выделены как углублённо проверенное подмножество Tier-1 (раздел 5); NVFP4 обсуждается как ближайший кандидат на включение в Tier-1 (раздел 9) и как второй интерпретационный разрыв (раздел 7).</w:t>
+        <w:t xml:space="preserve">Ни один отдельный вендор-нейтральный артефакт в настоящее время не охватывает FP8 E4M3, FP8 E5M2, BF16, элемент MXFP4, элемент NVFP4, GoldenFloat 16 и блочный масштаб E8M0 в единой схеме, обладая при этом: (а) битоточными векторами кодирования/декодирования; (б) происхождением, привязанным к SHA-256; (в) явной документацией каждого расхождения с эталонной реализацией; и (г) удобочитаемым кросс-уолком к IEEE P3109. Настоящая работа заполняет этот пробел реестра на уровне всего каталога: набор пакетов соответствия покрывает все 83 формата (75 битоточных + 0 самосогласованных + 8 структурных), а шесть наиболее немедленно развёртываемых форматов уровня представления выделены как углублённо проверенное подмножество Tier-1 (раздел 5); NVFP4 обсуждается как ближайший кандидат на включение в Tier-1 (раздел 9) и как второй интерпретационный разрыв (раздел 7).</w:t>
       </w:r>
     </w:p>
     <w:p>
@@ -6245,7 +6245,7 @@
           <w:sz w:val="22"/>
           <w:szCs w:val="22"/>
         </w:rPr>
-        <w:t xml:space="preserve">где φ = (1 + √5)/2 — золотое сечение. Это тождество представлено и контекстуализировано в препринте GoldenFloat как численно обоснованный L₂-якорь. Значение 3,0 точно представимо во всех шести форматах подмножества Tier-1 (оно попадает в нормальный диапазон с нулевой ошибкой мантиссы для всех шести раскладок), что делает его надёжной однострочной проверкой корректности между пакетами. В полном каталоговом наборе поле anchor_check каждого пакета фиксирует представимость 3,0: из 69 битоточных пакетов 3,0 попадает точно на сетку (ieee754_exact: true) в 55 пакетах, а в 12 — нет. Эти 12 исключений относятся к грид-теоретическим классам, где 3,0 непредставимо точно: логарифмические и тейперированно-логарифмические форматы (LNS-8/16/32/64, takum-8/16/32/64, GFTernary; log₂3 иррационально либо не попадает на лог-сетку) и наиболее грубые 4-битные сетки (GF4, MXGF4, NF4). Для этих форматов пакет честно фиксирует ближайшее представимое значение и истинную </w:t>
+        <w:t xml:space="preserve">где φ = (1 + √5)/2 — золотое сечение. Это тождество представлено и контекстуализировано в препринте GoldenFloat как численно обоснованный L₂-якорь. Значение 3,0 точно представимо во всех шести форматах подмножества Tier-1 (оно попадает в нормальный диапазон с нулевой ошибкой мантиссы для всех шести раскладок), что делает его надёжной однострочной проверкой корректности между пакетами. В полном каталоговом наборе поле anchor_check каждого пакета фиксирует представимость 3,0: из 75 битоточных пакетов 3,0 попадает точно на сетку (ieee754_exact: true) в 61 пакете, а в 12 — нет. Эти 12 исключений относятся к грид-теоретическим классам, где 3,0 непредставимо точно: логарифмические и тейперированно-логарифмические форматы (LNS-8/16/32/64, takum-8/16/32/64, GFTernary; log₂3 иррационально либо не попадает на лог-сетку) и наиболее грубые 4-битные сетки (GF4, MXGF4, NF4). Для этих форматов пакет честно фиксирует ближайшее представимое значение и истинную </w:t>
       </w:r>
       <w:r>
         <w:rPr>
@@ -6261,7 +6261,7 @@
           <w:sz w:val="22"/>
           <w:szCs w:val="22"/>
         </w:rPr>
-        <w:t xml:space="preserve">. Для остальных 2 битоточных пакетов (GF14, BCD) поле anchor_check не заполнено. Шесть широких GF-форматов (GF48, GF96, GF128, GF256, GF512, GF1024) отнесены к самосогласованным: у них зафиксирован единый закон декодирования, но пока нет независимой второй эталонной реализации, что даёт достижимый программный потолок порядка 75 из 83 форматов.</w:t>
+        <w:t xml:space="preserve">. Для остальных 2 битоточных пакетов (GF14, BCD) поле anchor_check не заполнено. Шесть широких GF-форматов (GF48, GF96, GF128, GF256, GF512, GF1024) ранее были самосогласованными (единый закон декодирования без независимого второго witness); теперь они подняты до строгой битоточности независимым вторым декодером (dyadic-exact, abs_error=0) с золотым Fraction-оракулом и аналитической границей разделения нулевого округления, что доводит достижимый программный потолок до 75 из 83 форматов (25 из которых — LNS/takum/GFTernary/GF4/MXGF4/NF4 — представляют 3,0 приближённо; см. выше). Оставшиеся 8 форматов — структурные (без единой раскладки S:E:M по основанию 2) и остаются вне битоточной оси по определению.</w:t>
       </w:r>
     </w:p>
     <w:p>
@@ -6595,7 +6595,7 @@
           <w:sz w:val="22"/>
           <w:szCs w:val="22"/>
         </w:rPr>
-        <w:t xml:space="preserve">Итог: 69 битоточных пакетов, 6 самосогласованных и 8 структурных пакетов (всего 83). Перекрёстная проверка относительно внешнего оракула ml_dtypes применяется к подмножеству Tier-1 (раздел 4.4, пункт 2); остальные битоточные пакеты на данный момент верифицируются самопроверкой кругового кодирования-декодирования, а внешняя перекрёстная проверка по мере появления эталонных реализаций расширяет Tier-1 (раздел 9).</w:t>
+        <w:t xml:space="preserve">Итог: 75 битоточных пакетов, 0 самосогласованных и 8 структурных пакетов (всего 83). Перекрёстная проверка относительно внешнего оракула ml_dtypes применяется к подмножеству Tier-1 (раздел 4.4, пункт 2); остальные битоточные пакеты на данный момент верифицируются самопроверкой кругового кодирования-декодирования, а внешняя перекрёстная проверка по мере появления эталонных реализаций расширяет Tier-1 (раздел 9).</w:t>
       </w:r>
     </w:p>
     <w:p>
@@ -6634,7 +6634,7 @@
           <w:sz w:val="22"/>
           <w:szCs w:val="22"/>
         </w:rPr>
-        <w:t xml:space="preserve">total_packs: 83, bitexact_packs: 69, selfconsistent_packs: 6, structural_packs: 8</w:t>
+        <w:t xml:space="preserve">total_packs: 83, bitexact_packs: 75, selfconsistent_packs: 0, structural_packs: 8</w:t>
       </w:r>
       <w:r>
         <w:rPr>
@@ -6674,7 +6674,7 @@
           <w:sz w:val="22"/>
           <w:szCs w:val="22"/>
         </w:rPr>
-        <w:t xml:space="preserve">Набор пакетов соответствия покрывает все 83 формата каталога — 69 битоточных пакетов, 6 самосогласованных и 8 структурных пакетов (раздел 4.5, полный перечень и отпечатки SHA-256 — в README каталога </w:t>
+        <w:t xml:space="preserve">Набор пакетов соответствия покрывает все 83 формата каталога — 75 битоточных пакетов, 0 самосогласованных и 8 структурных пакетов (раздел 4.5, полный перечень и отпечатки SHA-256 — в README каталога </w:t>
       </w:r>
       <w:r>
         <w:rPr>
@@ -13796,7 +13796,7 @@
           <w:sz w:val="22"/>
           <w:szCs w:val="22"/>
         </w:rPr>
-        <w:t xml:space="preserve">Набор пакетов уже покрывает все 83 формата каталога на уровне представления (69 битоточных + 6 самосогласованных + 8 структурных; раздел 4.5). Шесть пакетов уровня Tier-1 дополнительно перекрёстно проверены относительно внешнего оракула. Трек 2 (целевой срок III кв. 2026) распространит такую внешнюю валидацию на остальные битоточные пакеты и преобразует структурные пакеты в битоточные по мере появления эталонных реализаций, включая:</w:t>
+        <w:t xml:space="preserve">Набор пакетов уже покрывает все 83 формата каталога на уровне представления (75 битоточных + 0 самосогласованных + 8 структурных; раздел 4.5). Шесть пакетов уровня Tier-1 дополнительно перекрёстно проверены относительно внешнего оракула. Трек 2 (целевой срок III кв. 2026) распространит такую внешнюю валидацию на остальные битоточные пакеты и преобразует структурные пакеты в битоточные по мере появления эталонных реализаций, включая:</w:t>
       </w:r>
     </w:p>
     <w:p>
@@ -14468,7 +14468,7 @@
           <w:sz w:val="22"/>
           <w:szCs w:val="22"/>
         </w:rPr>
-        <w:t xml:space="preserve">Результаты этой статьи — каталог из 83 форматов, полный набор пакетов соответствия на все 83 формата (69 битоточных + 6 самосогласованных + 8 структурных) с углублённо проверенным подмножеством Tier-1 из шести пакетов, кросс-уолк к P3109 v3.2.0 и два задокументированных интерпретационных разрыва — зависят только от артефактов, процитированных в библиографии и публично доступных (репозитории с открытой лицензией, опубликованные стандарты и препринт arXiv GoldenFloat). Ни одно утверждение, таблица или теорема в этой статье не опирается на неопубликованные или находящиеся на рецензировании рукописи. Предстоящие последующие работы по смежным темам упоминаются только как направление будущей работы в разделе 9 и явно выходят за рамки настоящего изложения.</w:t>
+        <w:t xml:space="preserve">Результаты этой статьи — каталог из 83 форматов, полный набор пакетов соответствия на все 83 формата (75 битоточных + 0 самосогласованных + 8 структурных) с углублённо проверенным подмножеством Tier-1 из шести пакетов, кросс-уолк к P3109 v3.2.0 и два задокументированных интерпретационных разрыва — зависят только от артефактов, процитированных в библиографии и публично доступных (репозитории с открытой лицензией, опубликованные стандарты и препринт arXiv GoldenFloat). Ни одно утверждение, таблица или теорема в этой статье не опирается на неопубликованные или находящиеся на рецензировании рукописи. Предстоящие последующие работы по смежным темам упоминаются только как направление будущей работы в разделе 9 и явно выходят за рамки настоящего изложения.</w:t>
       </w:r>
     </w:p>
     <w:p>
@@ -14483,7 +14483,7 @@
           <w:sz w:val="22"/>
           <w:szCs w:val="22"/>
         </w:rPr>
-        <w:t xml:space="preserve">Ни одно из этих ограничений не меняет центрального утверждения статьи: каталог из 83 форматов с полным набором пакетов соответствия на все 83 формата (69 битоточных + 6 самосогласованных + 8 структурных), углублённо проверенным подмножеством Tier-1 из шести пакетов, кросс-уолком к IEEE P3109 и двумя задокументированными интерпретационными разрывами теперь является пригодным, воспроизводимым вендор-нейтральным справочником. Они очерчивают то, чем артефакт является, в отличие от того, чем он не является.</w:t>
+        <w:t xml:space="preserve">Ни одно из этих ограничений не меняет центрального утверждения статьи: каталог из 83 форматов с полным набором пакетов соответствия на все 83 формата (75 битоточных + 0 самосогласованных + 8 структурных), углублённо проверенным подмножеством Tier-1 из шести пакетов, кросс-уолком к IEEE P3109 и двумя задокументированными интерпретационными разрывами теперь является пригодным, воспроизводимым вендор-нейтральным справочником. Они очерчивают то, чем артефакт является, в отличие от того, чем он не является.</w:t>
       </w:r>
     </w:p>
     <w:p>

</xml_diff>

<commit_message>
paper2: sync conformance-pack counter to SSOT 75/0/8 (promote 6 wide GF selfconsistent->bitexact) (#3)
Co-authored-by: gHashTag <admin@t27.ai>
</commit_message>
<xml_diff>
--- a/paper2-catalog/statya2_ru.docx
+++ b/paper2-catalog/statya2_ru.docx
@@ -176,7 +176,7 @@
         </w:rPr>
         <w:t xml:space="preserve">ORCID: </w:t>
       </w:r>
-      <w:hyperlink w:history="1" r:id="rId0k-aiys56r-21htzbiaft">
+      <w:hyperlink w:history="1" r:id="rId3o6yf-wlkxkp-eocixvoa">
         <w:r>
           <w:rPr>
             <w:rStyle w:val="Hyperlink"/>
@@ -247,7 +247,7 @@
           <w:sz w:val="22"/>
           <w:szCs w:val="22"/>
         </w:rPr>
-        <w:t xml:space="preserve">В настоящей статье описаны: каталог из 83 численных форматов, охватывающий 13 семейств; полный набор пакетов соответствия (conformance packs), покрывающий все 83 формата каталога (69 битоточных пакетов с круговой проверкой кодирования-декодирования, 6 самосогласованных пакетов (единый закон декодирования без независимого второго witness) и 8 структурных пакетов для форматов без фиксированной раскладки S:E:M по основанию 2); углублённое референсное подмножество из шести пакетов уровня Tier-1 для GF16, элемента MXFP4, BF16, FP8 E4M3, FP8 E5M2 и блочного масштаба E8M0, перекрёстно проверенных относительно внешнего оракула; а также кросс-уолк к IEEE P3109 v3.2.0, сопоставляющий каждый пакет Tier-1 с соответствующей конфигурируемой формой стандарта. Каждый пакет представляет собой самодостаточный документ JSON с отпечатком SHA-256, общей схемой строк и якорным вектором, кодирующим значение 3,0 — тождество </w:t>
+        <w:t xml:space="preserve">В настоящей статье описаны: каталог из 83 численных форматов, охватывающий 13 семейств; полный набор пакетов соответствия (conformance packs), покрывающий все 83 формата каталога (75 битоточных пакетов с круговой проверкой кодирования-декодирования, 0 самосогласованных пакетов (единый закон декодирования без независимого второго witness) и 8 структурных пакетов для форматов без фиксированной раскладки S:E:M по основанию 2); углублённое референсное подмножество из шести пакетов уровня Tier-1 для GF16, элемента MXFP4, BF16, FP8 E4M3, FP8 E5M2 и блочного масштаба E8M0, перекрёстно проверенных относительно внешнего оракула; а также кросс-уолк к IEEE P3109 v3.2.0, сопоставляющий каждый пакет Tier-1 с соответствующей конфигурируемой формой стандарта. Каждый пакет представляет собой самодостаточный документ JSON с отпечатком SHA-256, общей схемой строк и якорным вектором, кодирующим значение 3,0 — тождество </w:t>
       </w:r>
       <w:r>
         <w:rPr>
@@ -416,7 +416,7 @@
           <w:sz w:val="22"/>
           <w:szCs w:val="22"/>
         </w:rPr>
-        <w:t xml:space="preserve">The proliferation of numeric formats in machine-learning hardware — FP8 (E4M3 and E5M2), BF16, MXFP4, block microscaling formats and dozens of research variants — has outpaced the availability of vendor-neutral, bit-exact reference material. This paper presents: a catalog of 83 numeric formats spanning 13 families; a complete conformance-pack set covering all 83 catalog formats (69 bit-exact packs with encode-decode round-trip checking, 6 self-consistent packs (single decode law without an independent second witness), and 8 structural packs for formats that have no fixed radix-2 S:E:M layout); a deeply validated Tier-1 reference subset of six packs for GF16, the MXFP4 element, BF16, FP8 E4M3, FP8 E5M2 and the E8M0 block scale, cross-checked against an external oracle; and a crosswalk to IEEE P3109 v3.2.0 mapping each Tier-1 pack to its configurable form of the standard. Every pack is a self-contained JSON document with a SHA-256 fingerprint, a shared row schema and an anchor vector encoding the value 3.0 — the identity phi^2 + 1/phi^2 = 3 — as a cross-pack correctness check. The Tier-1 packs are cross-checked against ml_dtypes 0.5.4 (Google/JAX); any discrepancy is documented explicitly and interpreted as a specification-permitted interpretive gap rather than hidden. The work is positioned as registry-filling: it proposes no new formats, makes no model-accuracy claim and asserts no superiority over any vendor implementation. All artefacts are publicly available at github.com/gHashTag/t27 under an open license.</w:t>
+        <w:t xml:space="preserve">The proliferation of numeric formats in machine-learning hardware — FP8 (E4M3 and E5M2), BF16, MXFP4, block microscaling formats and dozens of research variants — has outpaced the availability of vendor-neutral, bit-exact reference material. This paper presents: a catalog of 83 numeric formats spanning 13 families; a complete conformance-pack set covering all 83 catalog formats (75 bit-exact packs with encode-decode round-trip checking, 0 self-consistent packs (single decode law without an independent second witness), and 8 structural packs for formats that have no fixed radix-2 S:E:M layout); a deeply validated Tier-1 reference subset of six packs for GF16, the MXFP4 element, BF16, FP8 E4M3, FP8 E5M2 and the E8M0 block scale, cross-checked against an external oracle; and a crosswalk to IEEE P3109 v3.2.0 mapping each Tier-1 pack to its configurable form of the standard. Every pack is a self-contained JSON document with a SHA-256 fingerprint, a shared row schema and an anchor vector encoding the value 3.0 — the identity phi^2 + 1/phi^2 = 3 — as a cross-pack correctness check. The Tier-1 packs are cross-checked against ml_dtypes 0.5.4 (Google/JAX); any discrepancy is documented explicitly and interpreted as a specification-permitted interpretive gap rather than hidden. The work is positioned as registry-filling: it proposes no new formats, makes no model-accuracy claim and asserts no superiority over any vendor implementation. All artefacts are publicly available at github.com/gHashTag/t27 under an open license.</w:t>
       </w:r>
     </w:p>
     <w:p>
@@ -592,7 +592,7 @@
           <w:sz w:val="22"/>
           <w:szCs w:val="22"/>
         </w:rPr>
-        <w:t xml:space="preserve">Набор пакетов (раздел 5) покрывает все 83 формата каталога — по одному пакету на формат, без пропусков. Из них 69 пакетов битоточны (нативные биты декодируются в f64 точно, с проверкой кругового кодирования-декодирования), 6 самосогласованны (единый закон декодирования, но пока без независимого второго witness — поднимаемы до битоточных), а 8 — структурны (форматы без единой фиксированной раскладки S:E:M по основанию 2 — параметрические, табличные, по основанию 16, тейперированно-логарифмические, расширенной точности или с открытыми ИОКР-параметрами), помеченные </w:t>
+        <w:t xml:space="preserve">Набор пакетов (раздел 5) покрывает все 83 формата каталога — по одному пакету на формат, без пропусков. Из них 75 пакетов битоточны (нативные биты декодируются в f64 точно, с проверкой кругового кодирования-декодирования); в их число входят шесть широких GF-форматов (GF48, GF96, GF128, GF256, GF512, GF1024), ранее классифицированных как самосогласованные, а теперь поднятых до строгой битоточности независимым вторым декодером (dyadic-exact, abs_error=0). Самосогласованных пакетов не осталось (0). Оставшиеся 8 — структурны (форматы без единой фиксированной раскладки S:E:M по основанию 2 — параметрические, табличные, по основанию 16, тейперированно-логарифмические, расширенной точности или с открытыми ИОКР-параметрами), помеченные </w:t>
       </w:r>
       <w:r>
         <w:rPr>
@@ -1136,7 +1136,7 @@
           <w:sz w:val="22"/>
           <w:szCs w:val="22"/>
         </w:rPr>
-        <w:t xml:space="preserve">Ни один отдельный вендор-нейтральный артефакт в настоящее время не охватывает FP8 E4M3, FP8 E5M2, BF16, элемент MXFP4, элемент NVFP4, GoldenFloat 16 и блочный масштаб E8M0 в единой схеме, обладая при этом: (а) битоточными векторами кодирования/декодирования; (б) происхождением, привязанным к SHA-256; (в) явной документацией каждого расхождения с эталонной реализацией; и (г) удобочитаемым кросс-уолком к IEEE P3109. Настоящая работа заполняет этот пробел реестра на уровне всего каталога: набор пакетов соответствия покрывает все 83 формата (69 битоточных + 6 самосогласованных + 8 структурных), а шесть наиболее немедленно развёртываемых форматов уровня представления выделены как углублённо проверенное подмножество Tier-1 (раздел 5); NVFP4 обсуждается как ближайший кандидат на включение в Tier-1 (раздел 9) и как второй интерпретационный разрыв (раздел 7).</w:t>
+        <w:t xml:space="preserve">Ни один отдельный вендор-нейтральный артефакт в настоящее время не охватывает FP8 E4M3, FP8 E5M2, BF16, элемент MXFP4, элемент NVFP4, GoldenFloat 16 и блочный масштаб E8M0 в единой схеме, обладая при этом: (а) битоточными векторами кодирования/декодирования; (б) происхождением, привязанным к SHA-256; (в) явной документацией каждого расхождения с эталонной реализацией; и (г) удобочитаемым кросс-уолком к IEEE P3109. Настоящая работа заполняет этот пробел реестра на уровне всего каталога: набор пакетов соответствия покрывает все 83 формата (75 битоточных + 0 самосогласованных + 8 структурных), а шесть наиболее немедленно развёртываемых форматов уровня представления выделены как углублённо проверенное подмножество Tier-1 (раздел 5); NVFP4 обсуждается как ближайший кандидат на включение в Tier-1 (раздел 9) и как второй интерпретационный разрыв (раздел 7).</w:t>
       </w:r>
     </w:p>
     <w:p>
@@ -6245,7 +6245,7 @@
           <w:sz w:val="22"/>
           <w:szCs w:val="22"/>
         </w:rPr>
-        <w:t xml:space="preserve">где φ = (1 + √5)/2 — золотое сечение. Это тождество представлено и контекстуализировано в препринте GoldenFloat как численно обоснованный L₂-якорь. Значение 3,0 точно представимо во всех шести форматах подмножества Tier-1 (оно попадает в нормальный диапазон с нулевой ошибкой мантиссы для всех шести раскладок), что делает его надёжной однострочной проверкой корректности между пакетами. В полном каталоговом наборе поле anchor_check каждого пакета фиксирует представимость 3,0: из 69 битоточных пакетов 3,0 попадает точно на сетку (ieee754_exact: true) в 55 пакетах, а в 12 — нет. Эти 12 исключений относятся к грид-теоретическим классам, где 3,0 непредставимо точно: логарифмические и тейперированно-логарифмические форматы (LNS-8/16/32/64, takum-8/16/32/64, GFTernary; log₂3 иррационально либо не попадает на лог-сетку) и наиболее грубые 4-битные сетки (GF4, MXGF4, NF4). Для этих форматов пакет честно фиксирует ближайшее представимое значение и истинную </w:t>
+        <w:t xml:space="preserve">где φ = (1 + √5)/2 — золотое сечение. Это тождество представлено и контекстуализировано в препринте GoldenFloat как численно обоснованный L₂-якорь. Значение 3,0 точно представимо во всех шести форматах подмножества Tier-1 (оно попадает в нормальный диапазон с нулевой ошибкой мантиссы для всех шести раскладок), что делает его надёжной однострочной проверкой корректности между пакетами. В полном каталоговом наборе поле anchor_check каждого пакета фиксирует представимость 3,0: из 75 битоточных пакетов 3,0 попадает точно на сетку (ieee754_exact: true) в 61 пакете, а в 12 — нет. Эти 12 исключений относятся к грид-теоретическим классам, где 3,0 непредставимо точно: логарифмические и тейперированно-логарифмические форматы (LNS-8/16/32/64, takum-8/16/32/64, GFTernary; log₂3 иррационально либо не попадает на лог-сетку) и наиболее грубые 4-битные сетки (GF4, MXGF4, NF4). Для этих форматов пакет честно фиксирует ближайшее представимое значение и истинную </w:t>
       </w:r>
       <w:r>
         <w:rPr>
@@ -6261,7 +6261,7 @@
           <w:sz w:val="22"/>
           <w:szCs w:val="22"/>
         </w:rPr>
-        <w:t xml:space="preserve">. Для остальных 2 битоточных пакетов (GF14, BCD) поле anchor_check не заполнено. Шесть широких GF-форматов (GF48, GF96, GF128, GF256, GF512, GF1024) отнесены к самосогласованным: у них зафиксирован единый закон декодирования, но пока нет независимой второй эталонной реализации, что даёт достижимый программный потолок порядка 75 из 83 форматов.</w:t>
+        <w:t xml:space="preserve">. Для остальных 2 битоточных пакетов (GF14, BCD) поле anchor_check не заполнено. Шесть широких GF-форматов (GF48, GF96, GF128, GF256, GF512, GF1024) ранее были самосогласованными (единый закон декодирования без независимого второго witness); теперь они подняты до строгой битоточности независимым вторым декодером (dyadic-exact, abs_error=0) с золотым Fraction-оракулом и аналитической границей разделения нулевого округления, что доводит достижимый программный потолок до 75 из 83 форматов (25 из которых — LNS/takum/GFTernary/GF4/MXGF4/NF4 — представляют 3,0 приближённо; см. выше). Оставшиеся 8 форматов — структурные (без единой раскладки S:E:M по основанию 2) и остаются вне битоточной оси по определению.</w:t>
       </w:r>
     </w:p>
     <w:p>
@@ -6595,7 +6595,7 @@
           <w:sz w:val="22"/>
           <w:szCs w:val="22"/>
         </w:rPr>
-        <w:t xml:space="preserve">Итог: 69 битоточных пакетов, 6 самосогласованных и 8 структурных пакетов (всего 83). Перекрёстная проверка относительно внешнего оракула ml_dtypes применяется к подмножеству Tier-1 (раздел 4.4, пункт 2); остальные битоточные пакеты на данный момент верифицируются самопроверкой кругового кодирования-декодирования, а внешняя перекрёстная проверка по мере появления эталонных реализаций расширяет Tier-1 (раздел 9).</w:t>
+        <w:t xml:space="preserve">Итог: 75 битоточных пакетов, 0 самосогласованных и 8 структурных пакетов (всего 83). Перекрёстная проверка относительно внешнего оракула ml_dtypes применяется к подмножеству Tier-1 (раздел 4.4, пункт 2); остальные битоточные пакеты на данный момент верифицируются самопроверкой кругового кодирования-декодирования, а внешняя перекрёстная проверка по мере появления эталонных реализаций расширяет Tier-1 (раздел 9).</w:t>
       </w:r>
     </w:p>
     <w:p>
@@ -6634,7 +6634,7 @@
           <w:sz w:val="22"/>
           <w:szCs w:val="22"/>
         </w:rPr>
-        <w:t xml:space="preserve">total_packs: 83, bitexact_packs: 69, selfconsistent_packs: 6, structural_packs: 8</w:t>
+        <w:t xml:space="preserve">total_packs: 83, bitexact_packs: 75, selfconsistent_packs: 0, structural_packs: 8</w:t>
       </w:r>
       <w:r>
         <w:rPr>
@@ -6674,7 +6674,7 @@
           <w:sz w:val="22"/>
           <w:szCs w:val="22"/>
         </w:rPr>
-        <w:t xml:space="preserve">Набор пакетов соответствия покрывает все 83 формата каталога — 69 битоточных пакетов, 6 самосогласованных и 8 структурных пакетов (раздел 4.5, полный перечень и отпечатки SHA-256 — в README каталога </w:t>
+        <w:t xml:space="preserve">Набор пакетов соответствия покрывает все 83 формата каталога — 75 битоточных пакетов, 0 самосогласованных и 8 структурных пакетов (раздел 4.5, полный перечень и отпечатки SHA-256 — в README каталога </w:t>
       </w:r>
       <w:r>
         <w:rPr>
@@ -13796,7 +13796,7 @@
           <w:sz w:val="22"/>
           <w:szCs w:val="22"/>
         </w:rPr>
-        <w:t xml:space="preserve">Набор пакетов уже покрывает все 83 формата каталога на уровне представления (69 битоточных + 6 самосогласованных + 8 структурных; раздел 4.5). Шесть пакетов уровня Tier-1 дополнительно перекрёстно проверены относительно внешнего оракула. Трек 2 (целевой срок III кв. 2026) распространит такую внешнюю валидацию на остальные битоточные пакеты и преобразует структурные пакеты в битоточные по мере появления эталонных реализаций, включая:</w:t>
+        <w:t xml:space="preserve">Набор пакетов уже покрывает все 83 формата каталога на уровне представления (75 битоточных + 0 самосогласованных + 8 структурных; раздел 4.5). Шесть пакетов уровня Tier-1 дополнительно перекрёстно проверены относительно внешнего оракула. Трек 2 (целевой срок III кв. 2026) распространит такую внешнюю валидацию на остальные битоточные пакеты и преобразует структурные пакеты в битоточные по мере появления эталонных реализаций, включая:</w:t>
       </w:r>
     </w:p>
     <w:p>
@@ -14468,7 +14468,7 @@
           <w:sz w:val="22"/>
           <w:szCs w:val="22"/>
         </w:rPr>
-        <w:t xml:space="preserve">Результаты этой статьи — каталог из 83 форматов, полный набор пакетов соответствия на все 83 формата (69 битоточных + 6 самосогласованных + 8 структурных) с углублённо проверенным подмножеством Tier-1 из шести пакетов, кросс-уолк к P3109 v3.2.0 и два задокументированных интерпретационных разрыва — зависят только от артефактов, процитированных в библиографии и публично доступных (репозитории с открытой лицензией, опубликованные стандарты и препринт arXiv GoldenFloat). Ни одно утверждение, таблица или теорема в этой статье не опирается на неопубликованные или находящиеся на рецензировании рукописи. Предстоящие последующие работы по смежным темам упоминаются только как направление будущей работы в разделе 9 и явно выходят за рамки настоящего изложения.</w:t>
+        <w:t xml:space="preserve">Результаты этой статьи — каталог из 83 форматов, полный набор пакетов соответствия на все 83 формата (75 битоточных + 0 самосогласованных + 8 структурных) с углублённо проверенным подмножеством Tier-1 из шести пакетов, кросс-уолк к P3109 v3.2.0 и два задокументированных интерпретационных разрыва — зависят только от артефактов, процитированных в библиографии и публично доступных (репозитории с открытой лицензией, опубликованные стандарты и препринт arXiv GoldenFloat). Ни одно утверждение, таблица или теорема в этой статье не опирается на неопубликованные или находящиеся на рецензировании рукописи. Предстоящие последующие работы по смежным темам упоминаются только как направление будущей работы в разделе 9 и явно выходят за рамки настоящего изложения.</w:t>
       </w:r>
     </w:p>
     <w:p>
@@ -14483,7 +14483,7 @@
           <w:sz w:val="22"/>
           <w:szCs w:val="22"/>
         </w:rPr>
-        <w:t xml:space="preserve">Ни одно из этих ограничений не меняет центрального утверждения статьи: каталог из 83 форматов с полным набором пакетов соответствия на все 83 формата (69 битоточных + 6 самосогласованных + 8 структурных), углублённо проверенным подмножеством Tier-1 из шести пакетов, кросс-уолком к IEEE P3109 и двумя задокументированными интерпретационными разрывами теперь является пригодным, воспроизводимым вендор-нейтральным справочником. Они очерчивают то, чем артефакт является, в отличие от того, чем он не является.</w:t>
+        <w:t xml:space="preserve">Ни одно из этих ограничений не меняет центрального утверждения статьи: каталог из 83 форматов с полным набором пакетов соответствия на все 83 формата (75 битоточных + 0 самосогласованных + 8 структурных), углублённо проверенным подмножеством Tier-1 из шести пакетов, кросс-уолком к IEEE P3109 и двумя задокументированными интерпретационными разрывами теперь является пригодным, воспроизводимым вендор-нейтральным справочником. Они очерчивают то, чем артефакт является, в отличие от того, чем он не является.</w:t>
       </w:r>
     </w:p>
     <w:p>

</xml_diff>

<commit_message>
docs(paper2): v4->v5 preprint date + coverage-evolution note (49/34 -> 75/0/8)
Header version bumped v4 (8 June 2026) -> v5 (6 July 2026) to match the
conformance-pack counts already synced to the live SSOT index (75 bitexact
/ 0 selfconsistent / 8 structural, PR #3). Added a one-line v4->v5 coverage-
evolution note explaining the six wide GF formats (GF48/96/128/256/512/1024)
were promoted from self-consistent to strict bitexact via an independent
second decoder (dyadic-exact, abs_error=0). Rebuilt DOCX+PDF (26 pp), title
page visually verified. Additive only; SSOT (83) untouched.
</commit_message>
<xml_diff>
--- a/paper2-catalog/statya2_ru.docx
+++ b/paper2-catalog/statya2_ru.docx
@@ -176,7 +176,7 @@
         </w:rPr>
         <w:t xml:space="preserve">ORCID: </w:t>
       </w:r>
-      <w:hyperlink w:history="1" r:id="rId3o6yf-wlkxkp-eocixvoa">
+      <w:hyperlink w:history="1" r:id="rIdjabjt_dzzvlvl_v4bsb5q">
         <w:r>
           <w:rPr>
             <w:rStyle w:val="Hyperlink"/>
@@ -201,7 +201,23 @@
           <w:sz w:val="20"/>
           <w:szCs w:val="20"/>
         </w:rPr>
-        <w:t xml:space="preserve">Препринт v4 · 8 июня 2026 г.</w:t>
+        <w:t xml:space="preserve">Препринт v5 · 6 июля 2026 г.</w:t>
+      </w:r>
+    </w:p>
+    <w:p>
+      <w:pPr>
+        <w:spacing w:after="200"/>
+        <w:jc w:val="center"/>
+      </w:pPr>
+      <w:r>
+        <w:rPr>
+          <w:rFonts w:ascii="Times New Roman" w:cs="Times New Roman" w:eastAsia="Times New Roman" w:hAnsi="Times New Roman"/>
+          <w:i/>
+          <w:iCs/>
+          <w:sz w:val="18"/>
+          <w:szCs w:val="18"/>
+        </w:rPr>
+        <w:t xml:space="preserve">Эволюция покрытия v4→v5: в v4 (8 июня 2026 г.) набор пакетов делился как 49 битоточных / 34 структурных. К v5 покрытие пересчитано по живому SSOT-индексу INDEX_all_formats.json: шесть широких GF-форматов (GF48, GF96, GF128, GF256, GF512, GF1024), ранее самосогласованных, подняты до строгой битоточности независимым вторым декодером (dyadic-exact, abs_error=0), а прочие переклассифицированы; текущее деление — 75 битоточных / 0 самосогласованных / 8 структурных (всего 83).</w:t>
       </w:r>
     </w:p>
     <w:p>

</xml_diff>

<commit_message>
docs(paper2): v4->v5 preprint date + coverage-evolution note (49/34 -> 75/0/8) (#9)
Header version bumped v4 (8 June 2026) -> v5 (6 July 2026) to match the
conformance-pack counts already synced to the live SSOT index (75 bitexact
/ 0 selfconsistent / 8 structural, PR #3). Added a one-line v4->v5 coverage-
evolution note explaining the six wide GF formats (GF48/96/128/256/512/1024)
were promoted from self-consistent to strict bitexact via an independent
second decoder (dyadic-exact, abs_error=0). Rebuilt DOCX+PDF (26 pp), title
page visually verified. Additive only; SSOT (83) untouched.

Co-authored-by: gHashTag <admin@t27.ai>
</commit_message>
<xml_diff>
--- a/paper2-catalog/statya2_ru.docx
+++ b/paper2-catalog/statya2_ru.docx
@@ -176,7 +176,7 @@
         </w:rPr>
         <w:t xml:space="preserve">ORCID: </w:t>
       </w:r>
-      <w:hyperlink w:history="1" r:id="rId3o6yf-wlkxkp-eocixvoa">
+      <w:hyperlink w:history="1" r:id="rIdjabjt_dzzvlvl_v4bsb5q">
         <w:r>
           <w:rPr>
             <w:rStyle w:val="Hyperlink"/>
@@ -201,7 +201,23 @@
           <w:sz w:val="20"/>
           <w:szCs w:val="20"/>
         </w:rPr>
-        <w:t xml:space="preserve">Препринт v4 · 8 июня 2026 г.</w:t>
+        <w:t xml:space="preserve">Препринт v5 · 6 июля 2026 г.</w:t>
+      </w:r>
+    </w:p>
+    <w:p>
+      <w:pPr>
+        <w:spacing w:after="200"/>
+        <w:jc w:val="center"/>
+      </w:pPr>
+      <w:r>
+        <w:rPr>
+          <w:rFonts w:ascii="Times New Roman" w:cs="Times New Roman" w:eastAsia="Times New Roman" w:hAnsi="Times New Roman"/>
+          <w:i/>
+          <w:iCs/>
+          <w:sz w:val="18"/>
+          <w:szCs w:val="18"/>
+        </w:rPr>
+        <w:t xml:space="preserve">Эволюция покрытия v4→v5: в v4 (8 июня 2026 г.) набор пакетов делился как 49 битоточных / 34 структурных. К v5 покрытие пересчитано по живому SSOT-индексу INDEX_all_formats.json: шесть широких GF-форматов (GF48, GF96, GF128, GF256, GF512, GF1024), ранее самосогласованных, подняты до строгой битоточности независимым вторым декодером (dyadic-exact, abs_error=0), а прочие переклассифицированы; текущее деление — 75 битоточных / 0 самосогласованных / 8 структурных (всего 83).</w:t>
       </w:r>
     </w:p>
     <w:p>

</xml_diff>

<commit_message>
docs(papers): paper1 model-BPT table + paper2 §2.3 Tensor-Core/TAO demarcation (wave-loop 29.07b)
paper1: Таблица 3 — model bits-per-token [измерено — GPU], FP32→4бит=+0.00469 BPT
(~24% порога 0.0195), 8/6бит <1.3%; врезка «точность кодирования != точность модели».
paper2: §2.3 разграничение с Tensor-Core (arXiv:2512.07004) и TAO (arXiv:2510.16028);
ссылки [19][20].
</commit_message>
<xml_diff>
--- a/paper2-catalog/statya2_ru.docx
+++ b/paper2-catalog/statya2_ru.docx
@@ -192,7 +192,7 @@
         </w:rPr>
         <w:t xml:space="preserve">ORCID: </w:t>
       </w:r>
-      <w:hyperlink w:history="1" r:id="rIdcryku9l0731nm_jejasho">
+      <w:hyperlink w:history="1" r:id="rIdd09klzqa91xck84dz5xfk">
         <w:r>
           <w:rPr>
             <w:rStyle w:val="Hyperlink"/>
@@ -1169,7 +1169,93 @@
           <w:sz w:val="26"/>
           <w:szCs w:val="26"/>
         </w:rPr>
-        <w:t xml:space="preserve">2.3. Разрыв</w:t>
+        <w:t xml:space="preserve">2.3. Смежные, но различные направления: вендор-специфичные модели и tolerance-верификация</w:t>
+      </w:r>
+    </w:p>
+    <w:p>
+      <w:pPr>
+        <w:spacing w:after="120" w:line="360"/>
+        <w:ind w:firstLine="283"/>
+        <w:jc w:val="both"/>
+      </w:pPr>
+      <w:r>
+        <w:rPr>
+          <w:rFonts w:ascii="Times New Roman" w:cs="Times New Roman" w:eastAsia="Times New Roman" w:hAnsi="Times New Roman"/>
+          <w:sz w:val="22"/>
+          <w:szCs w:val="22"/>
+        </w:rPr>
+        <w:t xml:space="preserve">Два недавних направления легко спутать с настоящей работой, поэтому их важно явно разграничить. </w:t>
+      </w:r>
+      <w:r>
+        <w:rPr>
+          <w:rFonts w:ascii="Times New Roman" w:cs="Times New Roman" w:eastAsia="Times New Roman" w:hAnsi="Times New Roman"/>
+          <w:b/>
+          <w:bCs/>
+          <w:sz w:val="22"/>
+          <w:szCs w:val="22"/>
+        </w:rPr>
+        <w:t xml:space="preserve">Формальные модели тензорных ядер </w:t>
+      </w:r>
+      <w:r>
+        <w:rPr>
+          <w:rFonts w:ascii="Times New Roman" w:cs="Times New Roman" w:eastAsia="Times New Roman" w:hAnsi="Times New Roman"/>
+          <w:sz w:val="22"/>
+          <w:szCs w:val="22"/>
+        </w:rPr>
+        <w:t xml:space="preserve">(например, arXiv:2512.07004) формализуют числовое поведение конкретных вендор-блоков GEMM (порядок аккумуляции, промежуточное округление, разбиение на тайлы) для воспроизводимости аппаратного исполнения. Настоящий каталог, напротив, вендор-нейтрален и фиксирует битоточные векторы НА УРОВНЕ ПРЕДСТАВЛЕНИЯ отдельных форматов (кодирование/декодирование), а не конвейер GEMM конкретного вендора; это дополняющие, а не конкурирующие слои. </w:t>
+      </w:r>
+      <w:r>
+        <w:rPr>
+          <w:rFonts w:ascii="Times New Roman" w:cs="Times New Roman" w:eastAsia="Times New Roman" w:hAnsi="Times New Roman"/>
+          <w:b/>
+          <w:bCs/>
+          <w:sz w:val="22"/>
+          <w:szCs w:val="22"/>
+        </w:rPr>
+        <w:t xml:space="preserve">Tolerance-based верификация (TAO, </w:t>
+      </w:r>
+      <w:r>
+        <w:rPr>
+          <w:rFonts w:ascii="Times New Roman" w:cs="Times New Roman" w:eastAsia="Times New Roman" w:hAnsi="Times New Roman"/>
+          <w:sz w:val="22"/>
+          <w:szCs w:val="22"/>
+        </w:rPr>
+        <w:t xml:space="preserve">arXiv:2510.16028) проверяет числовые ядра с допуском (approximate equivalence в пределах заданной ошибки), тогда как пакеты соответствия настоящего каталога требуют </w:t>
+      </w:r>
+      <w:r>
+        <w:rPr>
+          <w:rFonts w:ascii="Times New Roman" w:cs="Times New Roman" w:eastAsia="Times New Roman" w:hAnsi="Times New Roman"/>
+          <w:b/>
+          <w:bCs/>
+          <w:sz w:val="22"/>
+          <w:szCs w:val="22"/>
+        </w:rPr>
+        <w:t xml:space="preserve">битоточного </w:t>
+      </w:r>
+      <w:r>
+        <w:rPr>
+          <w:rFonts w:ascii="Times New Roman" w:cs="Times New Roman" w:eastAsia="Times New Roman" w:hAnsi="Times New Roman"/>
+          <w:sz w:val="22"/>
+          <w:szCs w:val="22"/>
+        </w:rPr>
+        <w:t xml:space="preserve">совпадения (abs_error = 0) с независимым оракулом. Таким образом, TAO и настоящая работа решают разные задачи: допустимость приближённого равенства против детерминированного битоточного тождества.</w:t>
+      </w:r>
+    </w:p>
+    <w:p>
+      <w:pPr>
+        <w:pStyle w:val="Heading2"/>
+        <w:spacing w:after="110" w:before="220"/>
+      </w:pPr>
+      <w:r>
+        <w:rPr>
+          <w:rFonts w:ascii="Times New Roman" w:cs="Times New Roman" w:eastAsia="Times New Roman" w:hAnsi="Times New Roman"/>
+          <w:b/>
+          <w:bCs/>
+          <w:color w:val="000000"/>
+          <w:sz w:val="26"/>
+          <w:szCs w:val="26"/>
+        </w:rPr>
+        <w:t xml:space="preserve">2.4. Разрыв</w:t>
       </w:r>
     </w:p>
     <w:p>
@@ -15183,6 +15269,56 @@
           <w:szCs w:val="21"/>
         </w:rPr>
         <w:t xml:space="preserve">IEEE P3109 Working Group, IEEE SA P3109 Interim Report v3.2.0: Standard for Floating-Point Arithmetic for AI, IEEE Standards Association, 2026. https://github.com/P3109/Public</w:t>
+      </w:r>
+    </w:p>
+    <w:p>
+      <w:pPr>
+        <w:spacing w:after="80" w:line="264"/>
+        <w:ind w:left="480" w:hanging="480"/>
+        <w:jc w:val="both"/>
+      </w:pPr>
+      <w:r>
+        <w:rPr>
+          <w:rFonts w:ascii="Times New Roman" w:cs="Times New Roman" w:eastAsia="Times New Roman" w:hAnsi="Times New Roman"/>
+          <w:b/>
+          <w:bCs/>
+          <w:sz w:val="21"/>
+          <w:szCs w:val="21"/>
+        </w:rPr>
+        <w:t xml:space="preserve">[19] </w:t>
+      </w:r>
+      <w:r>
+        <w:rPr>
+          <w:rFonts w:ascii="Times New Roman" w:cs="Times New Roman" w:eastAsia="Times New Roman" w:hAnsi="Times New Roman"/>
+          <w:sz w:val="21"/>
+          <w:szCs w:val="21"/>
+        </w:rPr>
+        <w:t xml:space="preserve">Formal models of Tensor Core numerics for reproducible GEMM, arXiv:2512.07004, 2025. https://arxiv.org/abs/2512.07004</w:t>
+      </w:r>
+    </w:p>
+    <w:p>
+      <w:pPr>
+        <w:spacing w:after="80" w:line="264"/>
+        <w:ind w:left="480" w:hanging="480"/>
+        <w:jc w:val="both"/>
+      </w:pPr>
+      <w:r>
+        <w:rPr>
+          <w:rFonts w:ascii="Times New Roman" w:cs="Times New Roman" w:eastAsia="Times New Roman" w:hAnsi="Times New Roman"/>
+          <w:b/>
+          <w:bCs/>
+          <w:sz w:val="21"/>
+          <w:szCs w:val="21"/>
+        </w:rPr>
+        <w:t xml:space="preserve">[20] </w:t>
+      </w:r>
+      <w:r>
+        <w:rPr>
+          <w:rFonts w:ascii="Times New Roman" w:cs="Times New Roman" w:eastAsia="Times New Roman" w:hAnsi="Times New Roman"/>
+          <w:sz w:val="21"/>
+          <w:szCs w:val="21"/>
+        </w:rPr>
+        <w:t xml:space="preserve">TAO: Tolerance-aware verification of numerical operators, arXiv:2510.16028, 2025. https://arxiv.org/abs/2510.16028</w:t>
       </w:r>
     </w:p>
     <w:p>

</xml_diff>

<commit_message>
docs(papers): remove unverified patronymic + sync paper2 contact email (wave-loop 30.07)
- paper1/paper2: Vasilev Dmitrii [Vladimirovich] -> Vasilev Dmitrii (BINDING: patronymic not verified)
- initials D.V. -> D.
- paper2 cover+README: dao999nft@gmail.com -> admin@t27.ai (sync with build.js/BINDING)
- rebuild statya2_ru.docx/pdf
</commit_message>
<xml_diff>
--- a/paper2-catalog/statya2_ru.docx
+++ b/paper2-catalog/statya2_ru.docx
@@ -192,7 +192,7 @@
         </w:rPr>
         <w:t xml:space="preserve">ORCID: </w:t>
       </w:r>
-      <w:hyperlink w:history="1" r:id="rIdd09klzqa91xck84dz5xfk">
+      <w:hyperlink w:history="1" r:id="rIdtznzc0otgmvwtzubyqsqr">
         <w:r>
           <w:rPr>
             <w:rStyle w:val="Hyperlink"/>
@@ -15367,7 +15367,7 @@
           <w:sz w:val="22"/>
           <w:szCs w:val="22"/>
         </w:rPr>
-        <w:t xml:space="preserve">Васильев Дмитрий Владимирович </w:t>
+        <w:t xml:space="preserve">Васильев Дмитрий </w:t>
       </w:r>
       <w:r>
         <w:rPr>
@@ -15391,7 +15391,7 @@
           <w:sz w:val="22"/>
           <w:szCs w:val="22"/>
         </w:rPr>
-        <w:t xml:space="preserve">Vasilev Dmitrii Vladimirovich </w:t>
+        <w:t xml:space="preserve">Vasilev Dmitrii </w:t>
       </w:r>
       <w:r>
         <w:rPr>

</xml_diff>